<commit_message>
docs(diagrams): enriquecer documentacion con diagramas Mermaid de arquitectura, ERD, componentes y secuencia transaccional
</commit_message>
<xml_diff>
--- a/docs/07_Arquitectura_Sistema.docx
+++ b/docs/07_Arquitectura_Sistema.docx
@@ -302,7 +302,7 @@
               <w:jc w:val="left"/>
             </w:pPr>
             <w:r>
-              <w:t xml:space="preserve">1.0.0</w:t>
+              <w:t xml:space="preserve">1.1.0</w:t>
             </w:r>
           </w:p>
         </w:tc>
@@ -432,7 +432,7 @@
         <w:t xml:space="preserve"> </w:t>
       </w:r>
       <w:r>
-        <w:t xml:space="preserve">— UX / Front-End / Coordinación</w:t>
+        <w:t xml:space="preserve">— UX / Front-End / Coordinación General</w:t>
       </w:r>
     </w:p>
     <w:p>
@@ -526,7 +526,7 @@
         <w:t xml:space="preserve"> </w:t>
       </w:r>
       <w:r>
-        <w:t xml:space="preserve">* Sobreventa de prendas sin stock real disponible en el taller/almacén.</w:t>
+        <w:t xml:space="preserve">* Sobreventa de prendas sin stock real disponible en el taller o almacén.</w:t>
       </w:r>
       <w:r>
         <w:t xml:space="preserve"> </w:t>
@@ -550,7 +550,7 @@
         <w:t xml:space="preserve"> </w:t>
       </w:r>
       <w:r>
-        <w:t xml:space="preserve">➔</w:t>
+        <w:t xml:space="preserve">-&gt;</w:t>
       </w:r>
       <w:r>
         <w:t xml:space="preserve"> </w:t>
@@ -565,7 +565,7 @@
         <w:t xml:space="preserve"> </w:t>
       </w:r>
       <w:r>
-        <w:t xml:space="preserve">➔</w:t>
+        <w:t xml:space="preserve">-&gt;</w:t>
       </w:r>
       <w:r>
         <w:t xml:space="preserve"> </w:t>
@@ -580,7 +580,7 @@
         <w:t xml:space="preserve"> </w:t>
       </w:r>
       <w:r>
-        <w:t xml:space="preserve">➔</w:t>
+        <w:t xml:space="preserve">-&gt;</w:t>
       </w:r>
       <w:r>
         <w:t xml:space="preserve"> </w:t>
@@ -747,79 +747,196 @@
         <w:rPr>
           <w:rStyle w:val="VerbatimChar"/>
         </w:rPr>
-        <w:t xml:space="preserve">                       ┌───────────────────────────────────────┐</w:t>
-      </w:r>
-      <w:r>
-        <w:br/>
-      </w:r>
-      <w:r>
-        <w:rPr>
-          <w:rStyle w:val="VerbatimChar"/>
-        </w:rPr>
-        <w:t xml:space="preserve">                       │    ATRIBUTOS DE CALIDAD DEL SISTEMA   │</w:t>
-      </w:r>
-      <w:r>
-        <w:br/>
-      </w:r>
-      <w:r>
-        <w:rPr>
-          <w:rStyle w:val="VerbatimChar"/>
-        </w:rPr>
-        <w:t xml:space="preserve">                       └───────────────────┬───────────────────┘</w:t>
-      </w:r>
-      <w:r>
-        <w:br/>
-      </w:r>
-      <w:r>
-        <w:rPr>
-          <w:rStyle w:val="VerbatimChar"/>
-        </w:rPr>
-        <w:t xml:space="preserve">            ┌──────────────────┬───────────┴───────────┬──────────────────┐</w:t>
-      </w:r>
-      <w:r>
-        <w:br/>
-      </w:r>
-      <w:r>
-        <w:rPr>
-          <w:rStyle w:val="VerbatimChar"/>
-        </w:rPr>
-        <w:t xml:space="preserve">            ▼                  ▼                       ▼                  ▼</w:t>
-      </w:r>
-      <w:r>
-        <w:br/>
-      </w:r>
-      <w:r>
-        <w:rPr>
-          <w:rStyle w:val="VerbatimChar"/>
-        </w:rPr>
-        <w:t xml:space="preserve">    ┌──────────────┐   ┌──────────────┐        ┌──────────────┐   ┌──────────────┐</w:t>
-      </w:r>
-      <w:r>
-        <w:br/>
-      </w:r>
-      <w:r>
-        <w:rPr>
-          <w:rStyle w:val="VerbatimChar"/>
-        </w:rPr>
-        <w:t xml:space="preserve">    │ Rendimiento  │   │  Seguridad   │        │ Disponibilidad│   │  Usabilidad  │</w:t>
-      </w:r>
-      <w:r>
-        <w:br/>
-      </w:r>
-      <w:r>
-        <w:rPr>
-          <w:rStyle w:val="VerbatimChar"/>
-        </w:rPr>
-        <w:t xml:space="preserve">    │  (≤ 500 ms)  │   │ (JWT+Bcrypt) │        │ (99% Uptime) │   │(Mobile-First)│</w:t>
-      </w:r>
-      <w:r>
-        <w:br/>
-      </w:r>
-      <w:r>
-        <w:rPr>
-          <w:rStyle w:val="VerbatimChar"/>
-        </w:rPr>
-        <w:t xml:space="preserve">    └──────────────┘   └──────────────┘        └──────────────┘   └──────────────┘</w:t>
+        <w:t xml:space="preserve">mindmap</w:t>
+      </w:r>
+      <w:r>
+        <w:br/>
+      </w:r>
+      <w:r>
+        <w:rPr>
+          <w:rStyle w:val="VerbatimChar"/>
+        </w:rPr>
+        <w:t xml:space="preserve">  root((Atributos de Calidad))</w:t>
+      </w:r>
+      <w:r>
+        <w:br/>
+      </w:r>
+      <w:r>
+        <w:rPr>
+          <w:rStyle w:val="VerbatimChar"/>
+        </w:rPr>
+        <w:t xml:space="preserve">    Rendimiento</w:t>
+      </w:r>
+      <w:r>
+        <w:br/>
+      </w:r>
+      <w:r>
+        <w:rPr>
+          <w:rStyle w:val="VerbatimChar"/>
+        </w:rPr>
+        <w:t xml:space="preserve">      Latencia API &lt;= 500ms</w:t>
+      </w:r>
+      <w:r>
+        <w:br/>
+      </w:r>
+      <w:r>
+        <w:rPr>
+          <w:rStyle w:val="VerbatimChar"/>
+        </w:rPr>
+        <w:t xml:space="preserve">      Carga inicial PWA &lt; 1.5s</w:t>
+      </w:r>
+      <w:r>
+        <w:br/>
+      </w:r>
+      <w:r>
+        <w:rPr>
+          <w:rStyle w:val="VerbatimChar"/>
+        </w:rPr>
+        <w:t xml:space="preserve">      Build ultrarrápido con Vite</w:t>
+      </w:r>
+      <w:r>
+        <w:br/>
+      </w:r>
+      <w:r>
+        <w:rPr>
+          <w:rStyle w:val="VerbatimChar"/>
+        </w:rPr>
+        <w:t xml:space="preserve">    Seguridad</w:t>
+      </w:r>
+      <w:r>
+        <w:br/>
+      </w:r>
+      <w:r>
+        <w:rPr>
+          <w:rStyle w:val="VerbatimChar"/>
+        </w:rPr>
+        <w:t xml:space="preserve">      Cifrado de contraseñas Bcrypt</w:t>
+      </w:r>
+      <w:r>
+        <w:br/>
+      </w:r>
+      <w:r>
+        <w:rPr>
+          <w:rStyle w:val="VerbatimChar"/>
+        </w:rPr>
+        <w:t xml:space="preserve">      Autenticación Stateless JWT</w:t>
+      </w:r>
+      <w:r>
+        <w:br/>
+      </w:r>
+      <w:r>
+        <w:rPr>
+          <w:rStyle w:val="VerbatimChar"/>
+        </w:rPr>
+        <w:t xml:space="preserve">      Políticas CORS y Sanitización</w:t>
+      </w:r>
+      <w:r>
+        <w:br/>
+      </w:r>
+      <w:r>
+        <w:rPr>
+          <w:rStyle w:val="VerbatimChar"/>
+        </w:rPr>
+        <w:t xml:space="preserve">    Disponibilidad</w:t>
+      </w:r>
+      <w:r>
+        <w:br/>
+      </w:r>
+      <w:r>
+        <w:rPr>
+          <w:rStyle w:val="VerbatimChar"/>
+        </w:rPr>
+        <w:t xml:space="preserve">      99% Uptime en horario comercial</w:t>
+      </w:r>
+      <w:r>
+        <w:br/>
+      </w:r>
+      <w:r>
+        <w:rPr>
+          <w:rStyle w:val="VerbatimChar"/>
+        </w:rPr>
+        <w:t xml:space="preserve">      Despliegue distribuido en CDN</w:t>
+      </w:r>
+      <w:r>
+        <w:br/>
+      </w:r>
+      <w:r>
+        <w:rPr>
+          <w:rStyle w:val="VerbatimChar"/>
+        </w:rPr>
+        <w:t xml:space="preserve">      Estrategia Offline con PWA</w:t>
+      </w:r>
+      <w:r>
+        <w:br/>
+      </w:r>
+      <w:r>
+        <w:rPr>
+          <w:rStyle w:val="VerbatimChar"/>
+        </w:rPr>
+        <w:t xml:space="preserve">    Usabilidad</w:t>
+      </w:r>
+      <w:r>
+        <w:br/>
+      </w:r>
+      <w:r>
+        <w:rPr>
+          <w:rStyle w:val="VerbatimChar"/>
+        </w:rPr>
+        <w:t xml:space="preserve">      Metodología Mobile-First</w:t>
+      </w:r>
+      <w:r>
+        <w:br/>
+      </w:r>
+      <w:r>
+        <w:rPr>
+          <w:rStyle w:val="VerbatimChar"/>
+        </w:rPr>
+        <w:t xml:space="preserve">      Accesibilidad WCAG AA</w:t>
+      </w:r>
+      <w:r>
+        <w:br/>
+      </w:r>
+      <w:r>
+        <w:rPr>
+          <w:rStyle w:val="VerbatimChar"/>
+        </w:rPr>
+        <w:t xml:space="preserve">      Control de Roles RBAC</w:t>
+      </w:r>
+      <w:r>
+        <w:br/>
+      </w:r>
+      <w:r>
+        <w:rPr>
+          <w:rStyle w:val="VerbatimChar"/>
+        </w:rPr>
+        <w:t xml:space="preserve">    Mantenibilidad</w:t>
+      </w:r>
+      <w:r>
+        <w:br/>
+      </w:r>
+      <w:r>
+        <w:rPr>
+          <w:rStyle w:val="VerbatimChar"/>
+        </w:rPr>
+        <w:t xml:space="preserve">      TypeScript estricto</w:t>
+      </w:r>
+      <w:r>
+        <w:br/>
+      </w:r>
+      <w:r>
+        <w:rPr>
+          <w:rStyle w:val="VerbatimChar"/>
+        </w:rPr>
+        <w:t xml:space="preserve">      Pruebas unitarias con Vitest</w:t>
+      </w:r>
+      <w:r>
+        <w:br/>
+      </w:r>
+      <w:r>
+        <w:rPr>
+          <w:rStyle w:val="VerbatimChar"/>
+        </w:rPr>
+        <w:t xml:space="preserve">      Arquitectura en capas</w:t>
       </w:r>
     </w:p>
     <w:tbl>
@@ -900,7 +1017,7 @@
               <w:jc w:val="left"/>
             </w:pPr>
             <w:r>
-              <w:t xml:space="preserve">Tiempo de carga inicial &lt; 1.5s; tiempo de respuesta API ≤ 500 ms.</w:t>
+              <w:t xml:space="preserve">Tiempo de carga inicial &lt; 1.5s; tiempo de respuesta API &lt;= 500 ms.</w:t>
             </w:r>
           </w:p>
         </w:tc>
@@ -1168,196 +1285,130 @@
         <w:rPr>
           <w:rStyle w:val="VerbatimChar"/>
         </w:rPr>
-        <w:t xml:space="preserve">                                  ┌─────────────────────────┐</w:t>
-      </w:r>
-      <w:r>
-        <w:br/>
-      </w:r>
-      <w:r>
-        <w:rPr>
-          <w:rStyle w:val="VerbatimChar"/>
-        </w:rPr>
-        <w:t xml:space="preserve">                                  │   VISTA DE ESCENARIOS   │</w:t>
-      </w:r>
-      <w:r>
-        <w:br/>
-      </w:r>
-      <w:r>
-        <w:rPr>
-          <w:rStyle w:val="VerbatimChar"/>
-        </w:rPr>
-        <w:t xml:space="preserve">                                  │     (Casos de Uso)      │</w:t>
-      </w:r>
-      <w:r>
-        <w:br/>
-      </w:r>
-      <w:r>
-        <w:rPr>
-          <w:rStyle w:val="VerbatimChar"/>
-        </w:rPr>
-        <w:t xml:space="preserve">                                  └────────────┬────────────┘</w:t>
-      </w:r>
-      <w:r>
-        <w:br/>
-      </w:r>
-      <w:r>
-        <w:rPr>
-          <w:rStyle w:val="VerbatimChar"/>
-        </w:rPr>
-        <w:t xml:space="preserve">                                               │</w:t>
-      </w:r>
-      <w:r>
-        <w:br/>
-      </w:r>
-      <w:r>
-        <w:rPr>
-          <w:rStyle w:val="VerbatimChar"/>
-        </w:rPr>
-        <w:t xml:space="preserve">             ┌─────────────────────────────────┼─────────────────────────────────┐</w:t>
-      </w:r>
-      <w:r>
-        <w:br/>
-      </w:r>
-      <w:r>
-        <w:rPr>
-          <w:rStyle w:val="VerbatimChar"/>
-        </w:rPr>
-        <w:t xml:space="preserve">             │                                 │                                 │</w:t>
-      </w:r>
-      <w:r>
-        <w:br/>
-      </w:r>
-      <w:r>
-        <w:rPr>
-          <w:rStyle w:val="VerbatimChar"/>
-        </w:rPr>
-        <w:t xml:space="preserve">             ▼                                 ▼                                 ▼</w:t>
-      </w:r>
-      <w:r>
-        <w:br/>
-      </w:r>
-      <w:r>
-        <w:rPr>
-          <w:rStyle w:val="VerbatimChar"/>
-        </w:rPr>
-        <w:t xml:space="preserve">   ┌───────────────────┐             ┌───────────────────┐             ┌───────────────────┐</w:t>
-      </w:r>
-      <w:r>
-        <w:br/>
-      </w:r>
-      <w:r>
-        <w:rPr>
-          <w:rStyle w:val="VerbatimChar"/>
-        </w:rPr>
-        <w:t xml:space="preserve">   │    VISTA LÓGICA   │             │ VISTA DE PROCESOS │             │ VISTA DE DESARROLLO│</w:t>
-      </w:r>
-      <w:r>
-        <w:br/>
-      </w:r>
-      <w:r>
-        <w:rPr>
-          <w:rStyle w:val="VerbatimChar"/>
-        </w:rPr>
-        <w:t xml:space="preserve">   │  (Capas y Módulos)│             │  (Concurrencia y  │             │   (Estructura de  │</w:t>
-      </w:r>
-      <w:r>
-        <w:br/>
-      </w:r>
-      <w:r>
-        <w:rPr>
-          <w:rStyle w:val="VerbatimChar"/>
-        </w:rPr>
-        <w:t xml:space="preserve">   │                   │             │   Transacciones)  │             │    Directorios)   │</w:t>
-      </w:r>
-      <w:r>
-        <w:br/>
-      </w:r>
-      <w:r>
-        <w:rPr>
-          <w:rStyle w:val="VerbatimChar"/>
-        </w:rPr>
-        <w:t xml:space="preserve">   └─────────┬─────────┘             └─────────┬─────────┘             └─────────┬─────────┘</w:t>
-      </w:r>
-      <w:r>
-        <w:br/>
-      </w:r>
-      <w:r>
-        <w:rPr>
-          <w:rStyle w:val="VerbatimChar"/>
-        </w:rPr>
-        <w:t xml:space="preserve">             │                                 │                                 │</w:t>
-      </w:r>
-      <w:r>
-        <w:br/>
-      </w:r>
-      <w:r>
-        <w:rPr>
-          <w:rStyle w:val="VerbatimChar"/>
-        </w:rPr>
-        <w:t xml:space="preserve">             └─────────────────────────────────┼─────────────────────────────────┘</w:t>
-      </w:r>
-      <w:r>
-        <w:br/>
-      </w:r>
-      <w:r>
-        <w:rPr>
-          <w:rStyle w:val="VerbatimChar"/>
-        </w:rPr>
-        <w:t xml:space="preserve">                                               │</w:t>
-      </w:r>
-      <w:r>
-        <w:br/>
-      </w:r>
-      <w:r>
-        <w:rPr>
-          <w:rStyle w:val="VerbatimChar"/>
-        </w:rPr>
-        <w:t xml:space="preserve">                                               ▼</w:t>
-      </w:r>
-      <w:r>
-        <w:br/>
-      </w:r>
-      <w:r>
-        <w:rPr>
-          <w:rStyle w:val="VerbatimChar"/>
-        </w:rPr>
-        <w:t xml:space="preserve">                                     ┌───────────────────┐</w:t>
-      </w:r>
-      <w:r>
-        <w:br/>
-      </w:r>
-      <w:r>
-        <w:rPr>
-          <w:rStyle w:val="VerbatimChar"/>
-        </w:rPr>
-        <w:t xml:space="preserve">                                     │    VISTA FÍSICA   │</w:t>
-      </w:r>
-      <w:r>
-        <w:br/>
-      </w:r>
-      <w:r>
-        <w:rPr>
-          <w:rStyle w:val="VerbatimChar"/>
-        </w:rPr>
-        <w:t xml:space="preserve">                                     │  (Infraestructura │</w:t>
-      </w:r>
-      <w:r>
-        <w:br/>
-      </w:r>
-      <w:r>
-        <w:rPr>
-          <w:rStyle w:val="VerbatimChar"/>
-        </w:rPr>
-        <w:t xml:space="preserve">                                     │   y Despliegue)   │</w:t>
-      </w:r>
-      <w:r>
-        <w:br/>
-      </w:r>
-      <w:r>
-        <w:rPr>
-          <w:rStyle w:val="VerbatimChar"/>
-        </w:rPr>
-        <w:t xml:space="preserve">                                     └───────────────────┘</w:t>
+        <w:t xml:space="preserve">flowchart TD</w:t>
+      </w:r>
+      <w:r>
+        <w:br/>
+      </w:r>
+      <w:r>
+        <w:rPr>
+          <w:rStyle w:val="VerbatimChar"/>
+        </w:rPr>
+        <w:t xml:space="preserve">    subgraph Escenarios ["Vista de Escenarios (+1)"]</w:t>
+      </w:r>
+      <w:r>
+        <w:br/>
+      </w:r>
+      <w:r>
+        <w:rPr>
+          <w:rStyle w:val="VerbatimChar"/>
+        </w:rPr>
+        <w:t xml:space="preserve">        CU["Casos de Uso Críticos\n(Registrar Pedido, Control de Stock, Auditoría)"]</w:t>
+      </w:r>
+      <w:r>
+        <w:br/>
+      </w:r>
+      <w:r>
+        <w:rPr>
+          <w:rStyle w:val="VerbatimChar"/>
+        </w:rPr>
+        <w:t xml:space="preserve">    end</w:t>
+      </w:r>
+      <w:r>
+        <w:br/>
+      </w:r>
+      <w:r>
+        <w:br/>
+      </w:r>
+      <w:r>
+        <w:rPr>
+          <w:rStyle w:val="VerbatimChar"/>
+        </w:rPr>
+        <w:t xml:space="preserve">    subgraph Arquitectura ["Vistas de Ingeniería"]</w:t>
+      </w:r>
+      <w:r>
+        <w:br/>
+      </w:r>
+      <w:r>
+        <w:rPr>
+          <w:rStyle w:val="VerbatimChar"/>
+        </w:rPr>
+        <w:t xml:space="preserve">        VL["Vista Lógica\n(Arquitectura Multicapa &amp; Componentes)"]</w:t>
+      </w:r>
+      <w:r>
+        <w:br/>
+      </w:r>
+      <w:r>
+        <w:rPr>
+          <w:rStyle w:val="VerbatimChar"/>
+        </w:rPr>
+        <w:t xml:space="preserve">        VP["Vista de Procesos\n(Transacciones ACID &amp; Máquina de Estados)"]</w:t>
+      </w:r>
+      <w:r>
+        <w:br/>
+      </w:r>
+      <w:r>
+        <w:rPr>
+          <w:rStyle w:val="VerbatimChar"/>
+        </w:rPr>
+        <w:t xml:space="preserve">        VD["Vista de Desarrollo\n(Monorepo Modular &amp; CI/CD)"]</w:t>
+      </w:r>
+      <w:r>
+        <w:br/>
+      </w:r>
+      <w:r>
+        <w:rPr>
+          <w:rStyle w:val="VerbatimChar"/>
+        </w:rPr>
+        <w:t xml:space="preserve">        VF["Vista Física\n(Infraestructura Cloud &amp; Despliegue)"]</w:t>
+      </w:r>
+      <w:r>
+        <w:br/>
+      </w:r>
+      <w:r>
+        <w:rPr>
+          <w:rStyle w:val="VerbatimChar"/>
+        </w:rPr>
+        <w:t xml:space="preserve">    end</w:t>
+      </w:r>
+      <w:r>
+        <w:br/>
+      </w:r>
+      <w:r>
+        <w:br/>
+      </w:r>
+      <w:r>
+        <w:rPr>
+          <w:rStyle w:val="VerbatimChar"/>
+        </w:rPr>
+        <w:t xml:space="preserve">    CU --&gt; VL</w:t>
+      </w:r>
+      <w:r>
+        <w:br/>
+      </w:r>
+      <w:r>
+        <w:rPr>
+          <w:rStyle w:val="VerbatimChar"/>
+        </w:rPr>
+        <w:t xml:space="preserve">    CU --&gt; VP</w:t>
+      </w:r>
+      <w:r>
+        <w:br/>
+      </w:r>
+      <w:r>
+        <w:rPr>
+          <w:rStyle w:val="VerbatimChar"/>
+        </w:rPr>
+        <w:t xml:space="preserve">    CU --&gt; VD</w:t>
+      </w:r>
+      <w:r>
+        <w:br/>
+      </w:r>
+      <w:r>
+        <w:rPr>
+          <w:rStyle w:val="VerbatimChar"/>
+        </w:rPr>
+        <w:t xml:space="preserve">    CU --&gt; VF</w:t>
       </w:r>
     </w:p>
     <w:p>
@@ -1367,21 +1418,13 @@
         </w:pict>
       </w:r>
     </w:p>
-    <w:bookmarkStart w:id="18" w:name="vista-lógica-arquitectura-multicapa"/>
+    <w:bookmarkStart w:id="18" w:name="Xbac19d45ec4211f20b11617e5a3bdf3f8a5f086"/>
     <w:p>
       <w:pPr>
         <w:pStyle w:val="Heading3"/>
       </w:pPr>
       <w:r>
-        <w:t xml:space="preserve">4.1. Vista Lógica: Arquitectura Multicapa</w:t>
-      </w:r>
-    </w:p>
-    <w:p>
-      <w:pPr>
-        <w:pStyle w:val="FirstParagraph"/>
-      </w:pPr>
-      <w:r>
-        <w:t xml:space="preserve">El sistema implementa una arquitectura desacoplada en cuatro niveles principales:</w:t>
+        <w:t xml:space="preserve">4.1. Vista Lógica: Arquitectura Multicapa y Flujo de Información</w:t>
       </w:r>
     </w:p>
     <w:p>
@@ -1392,214 +1435,352 @@
         <w:rPr>
           <w:rStyle w:val="VerbatimChar"/>
         </w:rPr>
-        <w:t xml:space="preserve">┌─────────────────────────────────────────────────────────────────────────────┐</w:t>
-      </w:r>
-      <w:r>
-        <w:br/>
-      </w:r>
-      <w:r>
-        <w:rPr>
-          <w:rStyle w:val="VerbatimChar"/>
-        </w:rPr>
-        <w:t xml:space="preserve">│ 1. CAPA DE PRESENTACIÓN (Frontend PWA - React 19 + TypeScript + Tailwind)   │</w:t>
-      </w:r>
-      <w:r>
-        <w:br/>
-      </w:r>
-      <w:r>
-        <w:rPr>
-          <w:rStyle w:val="VerbatimChar"/>
-        </w:rPr>
-        <w:t xml:space="preserve">│    ├── Páginas: Login, Dashboard, PedidosLista, PedidoForm, ProductosGestion│</w:t>
-      </w:r>
-      <w:r>
-        <w:br/>
-      </w:r>
-      <w:r>
-        <w:rPr>
-          <w:rStyle w:val="VerbatimChar"/>
-        </w:rPr>
-        <w:t xml:space="preserve">│    ├── Componentes Reutilizables: Navbar, Modal, Badge, StatCard            │</w:t>
-      </w:r>
-      <w:r>
-        <w:br/>
-      </w:r>
-      <w:r>
-        <w:rPr>
-          <w:rStyle w:val="VerbatimChar"/>
-        </w:rPr>
-        <w:t xml:space="preserve">│    └── Estado Global: AppContext (Autenticación, Carrito, Pedidos, Stock)   │</w:t>
-      </w:r>
-      <w:r>
-        <w:br/>
-      </w:r>
-      <w:r>
-        <w:rPr>
-          <w:rStyle w:val="VerbatimChar"/>
-        </w:rPr>
-        <w:t xml:space="preserve">└──────────────────────────────────────┬──────────────────────────────────────┘</w:t>
-      </w:r>
-      <w:r>
-        <w:br/>
-      </w:r>
-      <w:r>
-        <w:rPr>
-          <w:rStyle w:val="VerbatimChar"/>
-        </w:rPr>
-        <w:t xml:space="preserve">                                       │ HTTPS / JSON (REST API)</w:t>
-      </w:r>
-      <w:r>
-        <w:br/>
-      </w:r>
-      <w:r>
-        <w:rPr>
-          <w:rStyle w:val="VerbatimChar"/>
-        </w:rPr>
-        <w:t xml:space="preserve">┌──────────────────────────────────────▼──────────────────────────────────────┐</w:t>
-      </w:r>
-      <w:r>
-        <w:br/>
-      </w:r>
-      <w:r>
-        <w:rPr>
-          <w:rStyle w:val="VerbatimChar"/>
-        </w:rPr>
-        <w:t xml:space="preserve">│ 2. CAPA DE APLICACIÓN / SERVICIOS (Backend API - Node.js + Express)         │</w:t>
-      </w:r>
-      <w:r>
-        <w:br/>
-      </w:r>
-      <w:r>
-        <w:rPr>
-          <w:rStyle w:val="VerbatimChar"/>
-        </w:rPr>
-        <w:t xml:space="preserve">│    ├── Routers &amp; Controllers: Auth, Orders, Products, Clients, Dashboard    │</w:t>
-      </w:r>
-      <w:r>
-        <w:br/>
-      </w:r>
-      <w:r>
-        <w:rPr>
-          <w:rStyle w:val="VerbatimChar"/>
-        </w:rPr>
-        <w:t xml:space="preserve">│    ├── Middlewares: AuthGuard (JWT), InputValidator (Zod), RateLimiter, CORS│</w:t>
-      </w:r>
-      <w:r>
-        <w:br/>
-      </w:r>
-      <w:r>
-        <w:rPr>
-          <w:rStyle w:val="VerbatimChar"/>
-        </w:rPr>
-        <w:t xml:space="preserve">│    └── Services / Lógica de Negocio: OrderService, InventoryEngine, KPIEngine│</w:t>
-      </w:r>
-      <w:r>
-        <w:br/>
-      </w:r>
-      <w:r>
-        <w:rPr>
-          <w:rStyle w:val="VerbatimChar"/>
-        </w:rPr>
-        <w:t xml:space="preserve">└──────────────────────────────────────┬──────────────────────────────────────┘</w:t>
-      </w:r>
-      <w:r>
-        <w:br/>
-      </w:r>
-      <w:r>
-        <w:rPr>
-          <w:rStyle w:val="VerbatimChar"/>
-        </w:rPr>
-        <w:t xml:space="preserve">                                       │ SQL Queries / ORM Mapping</w:t>
-      </w:r>
-      <w:r>
-        <w:br/>
-      </w:r>
-      <w:r>
-        <w:rPr>
-          <w:rStyle w:val="VerbatimChar"/>
-        </w:rPr>
-        <w:t xml:space="preserve">┌──────────────────────────────────────▼──────────────────────────────────────┐</w:t>
-      </w:r>
-      <w:r>
-        <w:br/>
-      </w:r>
-      <w:r>
-        <w:rPr>
-          <w:rStyle w:val="VerbatimChar"/>
-        </w:rPr>
-        <w:t xml:space="preserve">│ 3. CAPA DE ACCESO A DATOS (Data Access Layer - Prisma ORM / Sequelize)      │</w:t>
-      </w:r>
-      <w:r>
-        <w:br/>
-      </w:r>
-      <w:r>
-        <w:rPr>
-          <w:rStyle w:val="VerbatimChar"/>
-        </w:rPr>
-        <w:t xml:space="preserve">│    ├── Modelos / Entidades: User, Product, Variant, Client, Order, OrderItem│</w:t>
-      </w:r>
-      <w:r>
-        <w:br/>
-      </w:r>
-      <w:r>
-        <w:rPr>
-          <w:rStyle w:val="VerbatimChar"/>
-        </w:rPr>
-        <w:t xml:space="preserve">│    └── Transacciones ACID: Descuento atómico de stock y auditoría de estado │</w:t>
-      </w:r>
-      <w:r>
-        <w:br/>
-      </w:r>
-      <w:r>
-        <w:rPr>
-          <w:rStyle w:val="VerbatimChar"/>
-        </w:rPr>
-        <w:t xml:space="preserve">└──────────────────────────────────────┬──────────────────────────────────────┘</w:t>
-      </w:r>
-      <w:r>
-        <w:br/>
-      </w:r>
-      <w:r>
-        <w:rPr>
-          <w:rStyle w:val="VerbatimChar"/>
-        </w:rPr>
-        <w:t xml:space="preserve">                                       │ TCP / Pool de Conexiones</w:t>
-      </w:r>
-      <w:r>
-        <w:br/>
-      </w:r>
-      <w:r>
-        <w:rPr>
-          <w:rStyle w:val="VerbatimChar"/>
-        </w:rPr>
-        <w:t xml:space="preserve">┌──────────────────────────────────────▼──────────────────────────────────────┐</w:t>
-      </w:r>
-      <w:r>
-        <w:br/>
-      </w:r>
-      <w:r>
-        <w:rPr>
-          <w:rStyle w:val="VerbatimChar"/>
-        </w:rPr>
-        <w:t xml:space="preserve">│ 4. CAPA DE PERSISTENCIA (Base de Datos Relacional - PostgreSQL / MySQL)     │</w:t>
-      </w:r>
-      <w:r>
-        <w:br/>
-      </w:r>
-      <w:r>
-        <w:rPr>
-          <w:rStyle w:val="VerbatimChar"/>
-        </w:rPr>
-        <w:t xml:space="preserve">│    └── Tablas relacionales con índices optimizados y restricciones FK       │</w:t>
-      </w:r>
-      <w:r>
-        <w:br/>
-      </w:r>
-      <w:r>
-        <w:rPr>
-          <w:rStyle w:val="VerbatimChar"/>
-        </w:rPr>
-        <w:t xml:space="preserve">└─────────────────────────────────────────────────────────────────────────────┘</w:t>
+        <w:t xml:space="preserve">flowchart TB</w:t>
+      </w:r>
+      <w:r>
+        <w:br/>
+      </w:r>
+      <w:r>
+        <w:rPr>
+          <w:rStyle w:val="VerbatimChar"/>
+        </w:rPr>
+        <w:t xml:space="preserve">    subgraph Presentacion ["1. Capa de Presentación (Frontend PWA)"]</w:t>
+      </w:r>
+      <w:r>
+        <w:br/>
+      </w:r>
+      <w:r>
+        <w:rPr>
+          <w:rStyle w:val="VerbatimChar"/>
+        </w:rPr>
+        <w:t xml:space="preserve">        UI_Login["Módulo Login &amp; Acceso"]</w:t>
+      </w:r>
+      <w:r>
+        <w:br/>
+      </w:r>
+      <w:r>
+        <w:rPr>
+          <w:rStyle w:val="VerbatimChar"/>
+        </w:rPr>
+        <w:t xml:space="preserve">        UI_Dash["Dashboard &amp; KPIs"]</w:t>
+      </w:r>
+      <w:r>
+        <w:br/>
+      </w:r>
+      <w:r>
+        <w:rPr>
+          <w:rStyle w:val="VerbatimChar"/>
+        </w:rPr>
+        <w:t xml:space="preserve">        UI_Orders["Gestor de Pedidos"]</w:t>
+      </w:r>
+      <w:r>
+        <w:br/>
+      </w:r>
+      <w:r>
+        <w:rPr>
+          <w:rStyle w:val="VerbatimChar"/>
+        </w:rPr>
+        <w:t xml:space="preserve">        UI_Products["Control de Inventario"]</w:t>
+      </w:r>
+      <w:r>
+        <w:br/>
+      </w:r>
+      <w:r>
+        <w:rPr>
+          <w:rStyle w:val="VerbatimChar"/>
+        </w:rPr>
+        <w:t xml:space="preserve">        AppContext["Estado Global (AppContext / Cache)"]</w:t>
+      </w:r>
+      <w:r>
+        <w:br/>
+      </w:r>
+      <w:r>
+        <w:rPr>
+          <w:rStyle w:val="VerbatimChar"/>
+        </w:rPr>
+        <w:t xml:space="preserve">        </w:t>
+      </w:r>
+      <w:r>
+        <w:br/>
+      </w:r>
+      <w:r>
+        <w:rPr>
+          <w:rStyle w:val="VerbatimChar"/>
+        </w:rPr>
+        <w:t xml:space="preserve">        UI_Login --&gt; AppContext</w:t>
+      </w:r>
+      <w:r>
+        <w:br/>
+      </w:r>
+      <w:r>
+        <w:rPr>
+          <w:rStyle w:val="VerbatimChar"/>
+        </w:rPr>
+        <w:t xml:space="preserve">        UI_Dash --&gt; AppContext</w:t>
+      </w:r>
+      <w:r>
+        <w:br/>
+      </w:r>
+      <w:r>
+        <w:rPr>
+          <w:rStyle w:val="VerbatimChar"/>
+        </w:rPr>
+        <w:t xml:space="preserve">        UI_Orders --&gt; AppContext</w:t>
+      </w:r>
+      <w:r>
+        <w:br/>
+      </w:r>
+      <w:r>
+        <w:rPr>
+          <w:rStyle w:val="VerbatimChar"/>
+        </w:rPr>
+        <w:t xml:space="preserve">        UI_Products --&gt; AppContext</w:t>
+      </w:r>
+      <w:r>
+        <w:br/>
+      </w:r>
+      <w:r>
+        <w:rPr>
+          <w:rStyle w:val="VerbatimChar"/>
+        </w:rPr>
+        <w:t xml:space="preserve">    end</w:t>
+      </w:r>
+      <w:r>
+        <w:br/>
+      </w:r>
+      <w:r>
+        <w:br/>
+      </w:r>
+      <w:r>
+        <w:rPr>
+          <w:rStyle w:val="VerbatimChar"/>
+        </w:rPr>
+        <w:t xml:space="preserve">    subgraph Aplicacion ["2. Capa de Aplicación (API REST Node.js / Express)"]</w:t>
+      </w:r>
+      <w:r>
+        <w:br/>
+      </w:r>
+      <w:r>
+        <w:rPr>
+          <w:rStyle w:val="VerbatimChar"/>
+        </w:rPr>
+        <w:t xml:space="preserve">        Router["Enrutador Principal &amp; CORS"]</w:t>
+      </w:r>
+      <w:r>
+        <w:br/>
+      </w:r>
+      <w:r>
+        <w:rPr>
+          <w:rStyle w:val="VerbatimChar"/>
+        </w:rPr>
+        <w:t xml:space="preserve">        AuthMiddleware["Middleware JWT &amp; RBAC Guard"]</w:t>
+      </w:r>
+      <w:r>
+        <w:br/>
+      </w:r>
+      <w:r>
+        <w:rPr>
+          <w:rStyle w:val="VerbatimChar"/>
+        </w:rPr>
+        <w:t xml:space="preserve">        Validator["Validador de Schemas (Zod)"]</w:t>
+      </w:r>
+      <w:r>
+        <w:br/>
+      </w:r>
+      <w:r>
+        <w:rPr>
+          <w:rStyle w:val="VerbatimChar"/>
+        </w:rPr>
+        <w:t xml:space="preserve">        </w:t>
+      </w:r>
+      <w:r>
+        <w:br/>
+      </w:r>
+      <w:r>
+        <w:rPr>
+          <w:rStyle w:val="VerbatimChar"/>
+        </w:rPr>
+        <w:t xml:space="preserve">        subgraph Servicios ["Servicios de Negocio"]</w:t>
+      </w:r>
+      <w:r>
+        <w:br/>
+      </w:r>
+      <w:r>
+        <w:rPr>
+          <w:rStyle w:val="VerbatimChar"/>
+        </w:rPr>
+        <w:t xml:space="preserve">            AuthSvc["AuthService"]</w:t>
+      </w:r>
+      <w:r>
+        <w:br/>
+      </w:r>
+      <w:r>
+        <w:rPr>
+          <w:rStyle w:val="VerbatimChar"/>
+        </w:rPr>
+        <w:t xml:space="preserve">            OrderSvc["OrderService"]</w:t>
+      </w:r>
+      <w:r>
+        <w:br/>
+      </w:r>
+      <w:r>
+        <w:rPr>
+          <w:rStyle w:val="VerbatimChar"/>
+        </w:rPr>
+        <w:t xml:space="preserve">            StockSvc["InventoryEngine"]</w:t>
+      </w:r>
+      <w:r>
+        <w:br/>
+      </w:r>
+      <w:r>
+        <w:rPr>
+          <w:rStyle w:val="VerbatimChar"/>
+        </w:rPr>
+        <w:t xml:space="preserve">            ReportSvc["KPIService"]</w:t>
+      </w:r>
+      <w:r>
+        <w:br/>
+      </w:r>
+      <w:r>
+        <w:rPr>
+          <w:rStyle w:val="VerbatimChar"/>
+        </w:rPr>
+        <w:t xml:space="preserve">        end</w:t>
+      </w:r>
+      <w:r>
+        <w:br/>
+      </w:r>
+      <w:r>
+        <w:br/>
+      </w:r>
+      <w:r>
+        <w:rPr>
+          <w:rStyle w:val="VerbatimChar"/>
+        </w:rPr>
+        <w:t xml:space="preserve">        Router --&gt; AuthMiddleware --&gt; Validator</w:t>
+      </w:r>
+      <w:r>
+        <w:br/>
+      </w:r>
+      <w:r>
+        <w:rPr>
+          <w:rStyle w:val="VerbatimChar"/>
+        </w:rPr>
+        <w:t xml:space="preserve">        Validator --&gt; AuthSvc</w:t>
+      </w:r>
+      <w:r>
+        <w:br/>
+      </w:r>
+      <w:r>
+        <w:rPr>
+          <w:rStyle w:val="VerbatimChar"/>
+        </w:rPr>
+        <w:t xml:space="preserve">        Validator --&gt; OrderSvc</w:t>
+      </w:r>
+      <w:r>
+        <w:br/>
+      </w:r>
+      <w:r>
+        <w:rPr>
+          <w:rStyle w:val="VerbatimChar"/>
+        </w:rPr>
+        <w:t xml:space="preserve">        Validator --&gt; StockSvc</w:t>
+      </w:r>
+      <w:r>
+        <w:br/>
+      </w:r>
+      <w:r>
+        <w:rPr>
+          <w:rStyle w:val="VerbatimChar"/>
+        </w:rPr>
+        <w:t xml:space="preserve">        Validator --&gt; ReportSvc</w:t>
+      </w:r>
+      <w:r>
+        <w:br/>
+      </w:r>
+      <w:r>
+        <w:rPr>
+          <w:rStyle w:val="VerbatimChar"/>
+        </w:rPr>
+        <w:t xml:space="preserve">    end</w:t>
+      </w:r>
+      <w:r>
+        <w:br/>
+      </w:r>
+      <w:r>
+        <w:br/>
+      </w:r>
+      <w:r>
+        <w:rPr>
+          <w:rStyle w:val="VerbatimChar"/>
+        </w:rPr>
+        <w:t xml:space="preserve">    subgraph Persistencia ["3. Capa de Acceso a Datos &amp; Base de Datos"]</w:t>
+      </w:r>
+      <w:r>
+        <w:br/>
+      </w:r>
+      <w:r>
+        <w:rPr>
+          <w:rStyle w:val="VerbatimChar"/>
+        </w:rPr>
+        <w:t xml:space="preserve">        ORM["Mapeador Objeto-Relacional (Prisma / Sequelize)"]</w:t>
+      </w:r>
+      <w:r>
+        <w:br/>
+      </w:r>
+      <w:r>
+        <w:rPr>
+          <w:rStyle w:val="VerbatimChar"/>
+        </w:rPr>
+        <w:t xml:space="preserve">        DB[(Base de Datos Relacional SQL\nPostgreSQL / MySQL)]</w:t>
+      </w:r>
+      <w:r>
+        <w:br/>
+      </w:r>
+      <w:r>
+        <w:rPr>
+          <w:rStyle w:val="VerbatimChar"/>
+        </w:rPr>
+        <w:t xml:space="preserve">        </w:t>
+      </w:r>
+      <w:r>
+        <w:br/>
+      </w:r>
+      <w:r>
+        <w:rPr>
+          <w:rStyle w:val="VerbatimChar"/>
+        </w:rPr>
+        <w:t xml:space="preserve">        Servicios --&gt; ORM</w:t>
+      </w:r>
+      <w:r>
+        <w:br/>
+      </w:r>
+      <w:r>
+        <w:rPr>
+          <w:rStyle w:val="VerbatimChar"/>
+        </w:rPr>
+        <w:t xml:space="preserve">        ORM --&gt; DB</w:t>
+      </w:r>
+      <w:r>
+        <w:br/>
+      </w:r>
+      <w:r>
+        <w:rPr>
+          <w:rStyle w:val="VerbatimChar"/>
+        </w:rPr>
+        <w:t xml:space="preserve">    end</w:t>
+      </w:r>
+      <w:r>
+        <w:br/>
+      </w:r>
+      <w:r>
+        <w:br/>
+      </w:r>
+      <w:r>
+        <w:rPr>
+          <w:rStyle w:val="VerbatimChar"/>
+        </w:rPr>
+        <w:t xml:space="preserve">    Presentacion -- "HTTPS / JSON (Bearer Token)" --&gt; Aplicacion</w:t>
       </w:r>
     </w:p>
     <w:p>
@@ -1610,21 +1791,13 @@
       </w:r>
     </w:p>
     <w:bookmarkEnd w:id="18"/>
-    <w:bookmarkStart w:id="19" w:name="Xe3120c49216ac43d71eea7186cc4315ffecd8e0"/>
+    <w:bookmarkStart w:id="19" w:name="Xa861ac0e922e99ba2dc77d5197683d59b6ba6dd"/>
     <w:p>
       <w:pPr>
         <w:pStyle w:val="Heading3"/>
       </w:pPr>
       <w:r>
-        <w:t xml:space="preserve">4.2. Vista de Procesos: Transaccionalidad Concurrente de Pedidos</w:t>
-      </w:r>
-    </w:p>
-    <w:p>
-      <w:pPr>
-        <w:pStyle w:val="FirstParagraph"/>
-      </w:pPr>
-      <w:r>
-        <w:t xml:space="preserve">Uno de los requerimientos más críticos es asegurar que no se vendan prendas que ya no tienen existencias físicas en el almacén. El siguiente flujo detalla el procesamiento concurrente y atómico:</w:t>
+        <w:t xml:space="preserve">4.2. Vista de Procesos: Secuencia Transaccional Atómica de Creación de Pedido</w:t>
       </w:r>
     </w:p>
     <w:p>
@@ -1635,205 +1808,334 @@
         <w:rPr>
           <w:rStyle w:val="VerbatimChar"/>
         </w:rPr>
-        <w:t xml:space="preserve">[ Cliente / Operador ]           [ API Controller ]             [ OrderService ]           [ Base de Datos ]</w:t>
-      </w:r>
-      <w:r>
-        <w:br/>
-      </w:r>
-      <w:r>
-        <w:rPr>
-          <w:rStyle w:val="VerbatimChar"/>
-        </w:rPr>
-        <w:t xml:space="preserve">        │                               │                               │                          │</w:t>
-      </w:r>
-      <w:r>
-        <w:br/>
-      </w:r>
-      <w:r>
-        <w:rPr>
-          <w:rStyle w:val="VerbatimChar"/>
-        </w:rPr>
-        <w:t xml:space="preserve">        │── 1. POST /api/orders ───────&gt;│                               │                          │</w:t>
-      </w:r>
-      <w:r>
-        <w:br/>
-      </w:r>
-      <w:r>
-        <w:rPr>
-          <w:rStyle w:val="VerbatimChar"/>
-        </w:rPr>
-        <w:t xml:space="preserve">        │   (payload con items y datos) │── 2. Validar JWT &amp; Schema ───&gt;│                          │</w:t>
-      </w:r>
-      <w:r>
-        <w:br/>
-      </w:r>
-      <w:r>
-        <w:rPr>
-          <w:rStyle w:val="VerbatimChar"/>
-        </w:rPr>
-        <w:t xml:space="preserve">        │                               │                               │── 3. INICIAR TRANSACCIÓN ─&gt;│</w:t>
-      </w:r>
-      <w:r>
-        <w:br/>
-      </w:r>
-      <w:r>
-        <w:rPr>
-          <w:rStyle w:val="VerbatimChar"/>
-        </w:rPr>
-        <w:t xml:space="preserve">        │                               │                               │                          │</w:t>
-      </w:r>
-      <w:r>
-        <w:br/>
-      </w:r>
-      <w:r>
-        <w:rPr>
-          <w:rStyle w:val="VerbatimChar"/>
-        </w:rPr>
-        <w:t xml:space="preserve">        │                               │                               │── 4. Bloquear y verificar│</w:t>
-      </w:r>
-      <w:r>
-        <w:br/>
-      </w:r>
-      <w:r>
-        <w:rPr>
-          <w:rStyle w:val="VerbatimChar"/>
-        </w:rPr>
-        <w:t xml:space="preserve">        │                               │                               │      stock por SKU ─────&gt;│</w:t>
-      </w:r>
-      <w:r>
-        <w:br/>
-      </w:r>
-      <w:r>
-        <w:rPr>
-          <w:rStyle w:val="VerbatimChar"/>
-        </w:rPr>
-        <w:t xml:space="preserve">        │                               │                               │                          │</w:t>
-      </w:r>
-      <w:r>
-        <w:br/>
-      </w:r>
-      <w:r>
-        <w:rPr>
-          <w:rStyle w:val="VerbatimChar"/>
-        </w:rPr>
-        <w:t xml:space="preserve">        │                               │                               │&lt;── Stock Disponible? ────│</w:t>
-      </w:r>
-      <w:r>
-        <w:br/>
-      </w:r>
-      <w:r>
-        <w:rPr>
-          <w:rStyle w:val="VerbatimChar"/>
-        </w:rPr>
-        <w:t xml:space="preserve">        │                               │                               │                          │</w:t>
-      </w:r>
-      <w:r>
-        <w:br/>
-      </w:r>
-      <w:r>
-        <w:rPr>
-          <w:rStyle w:val="VerbatimChar"/>
-        </w:rPr>
-        <w:t xml:space="preserve">        │                               │                  [ SI ]       │                          │</w:t>
-      </w:r>
-      <w:r>
-        <w:br/>
-      </w:r>
-      <w:r>
-        <w:rPr>
-          <w:rStyle w:val="VerbatimChar"/>
-        </w:rPr>
-        <w:t xml:space="preserve">        │                               │                    │          │── 5. Descontar Stock ────&gt;│</w:t>
-      </w:r>
-      <w:r>
-        <w:br/>
-      </w:r>
-      <w:r>
-        <w:rPr>
-          <w:rStyle w:val="VerbatimChar"/>
-        </w:rPr>
-        <w:t xml:space="preserve">        │                               │                    │          │── 6. Insertar Order ─────&gt;│</w:t>
-      </w:r>
-      <w:r>
-        <w:br/>
-      </w:r>
-      <w:r>
-        <w:rPr>
-          <w:rStyle w:val="VerbatimChar"/>
-        </w:rPr>
-        <w:t xml:space="preserve">        │                               │                    │          │── 7. Insertar Items ─────&gt;│</w:t>
-      </w:r>
-      <w:r>
-        <w:br/>
-      </w:r>
-      <w:r>
-        <w:rPr>
-          <w:rStyle w:val="VerbatimChar"/>
-        </w:rPr>
-        <w:t xml:space="preserve">        │                               │                    │          │── 8. Registrar Auditoría─&gt;│</w:t>
-      </w:r>
-      <w:r>
-        <w:br/>
-      </w:r>
-      <w:r>
-        <w:rPr>
-          <w:rStyle w:val="VerbatimChar"/>
-        </w:rPr>
-        <w:t xml:space="preserve">        │                               │                    │          │── 9. COMMIT TRANSACCIÓN ─&gt;│</w:t>
-      </w:r>
-      <w:r>
-        <w:br/>
-      </w:r>
-      <w:r>
-        <w:rPr>
-          <w:rStyle w:val="VerbatimChar"/>
-        </w:rPr>
-        <w:t xml:space="preserve">        │                               │                    │          │                          │</w:t>
-      </w:r>
-      <w:r>
-        <w:br/>
-      </w:r>
-      <w:r>
-        <w:rPr>
-          <w:rStyle w:val="VerbatimChar"/>
-        </w:rPr>
-        <w:t xml:space="preserve">        │                               │&lt;── Order Creado con Éxito ────│                          │</w:t>
-      </w:r>
-      <w:r>
-        <w:br/>
-      </w:r>
-      <w:r>
-        <w:rPr>
-          <w:rStyle w:val="VerbatimChar"/>
-        </w:rPr>
-        <w:t xml:space="preserve">        │&lt;── 201 Created (Order Data) ──│                               │                          │</w:t>
-      </w:r>
-      <w:r>
-        <w:br/>
-      </w:r>
-      <w:r>
-        <w:rPr>
-          <w:rStyle w:val="VerbatimChar"/>
-        </w:rPr>
-        <w:t xml:space="preserve">        │                               │                  [ NO ]       │                          │</w:t>
-      </w:r>
-      <w:r>
-        <w:br/>
-      </w:r>
-      <w:r>
-        <w:rPr>
-          <w:rStyle w:val="VerbatimChar"/>
-        </w:rPr>
-        <w:t xml:space="preserve">        │                               │                    │          │── ROLLBACK TRANSACCIÓN ──&gt;│</w:t>
-      </w:r>
-      <w:r>
-        <w:br/>
-      </w:r>
-      <w:r>
-        <w:rPr>
-          <w:rStyle w:val="VerbatimChar"/>
-        </w:rPr>
-        <w:t xml:space="preserve">        │&lt;── 409 Conflict (Sin Stock) ──│&lt;── Error: Stock Insuficiente ─│                          │</w:t>
+        <w:t xml:space="preserve">sequenceDiagram</w:t>
+      </w:r>
+      <w:r>
+        <w:br/>
+      </w:r>
+      <w:r>
+        <w:rPr>
+          <w:rStyle w:val="VerbatimChar"/>
+        </w:rPr>
+        <w:t xml:space="preserve">    autonumber</w:t>
+      </w:r>
+      <w:r>
+        <w:br/>
+      </w:r>
+      <w:r>
+        <w:rPr>
+          <w:rStyle w:val="VerbatimChar"/>
+        </w:rPr>
+        <w:t xml:space="preserve">    actor Operador as Dueño / Operador</w:t>
+      </w:r>
+      <w:r>
+        <w:br/>
+      </w:r>
+      <w:r>
+        <w:rPr>
+          <w:rStyle w:val="VerbatimChar"/>
+        </w:rPr>
+        <w:t xml:space="preserve">    participant PWA as PWA Frontend (React)</w:t>
+      </w:r>
+      <w:r>
+        <w:br/>
+      </w:r>
+      <w:r>
+        <w:rPr>
+          <w:rStyle w:val="VerbatimChar"/>
+        </w:rPr>
+        <w:t xml:space="preserve">    participant API as API Controller (Express)</w:t>
+      </w:r>
+      <w:r>
+        <w:br/>
+      </w:r>
+      <w:r>
+        <w:rPr>
+          <w:rStyle w:val="VerbatimChar"/>
+        </w:rPr>
+        <w:t xml:space="preserve">    participant Service as OrderService</w:t>
+      </w:r>
+      <w:r>
+        <w:br/>
+      </w:r>
+      <w:r>
+        <w:rPr>
+          <w:rStyle w:val="VerbatimChar"/>
+        </w:rPr>
+        <w:t xml:space="preserve">    participant DB as Base de Datos (SQL)</w:t>
+      </w:r>
+      <w:r>
+        <w:br/>
+      </w:r>
+      <w:r>
+        <w:br/>
+      </w:r>
+      <w:r>
+        <w:rPr>
+          <w:rStyle w:val="VerbatimChar"/>
+        </w:rPr>
+        <w:t xml:space="preserve">    Operador-&gt;&gt;PWA: Ingresa datos del cliente y prendas</w:t>
+      </w:r>
+      <w:r>
+        <w:br/>
+      </w:r>
+      <w:r>
+        <w:rPr>
+          <w:rStyle w:val="VerbatimChar"/>
+        </w:rPr>
+        <w:t xml:space="preserve">    PWA-&gt;&gt;PWA: Valida formulario y autocalcula subtotal/delivery</w:t>
+      </w:r>
+      <w:r>
+        <w:br/>
+      </w:r>
+      <w:r>
+        <w:rPr>
+          <w:rStyle w:val="VerbatimChar"/>
+        </w:rPr>
+        <w:t xml:space="preserve">    PWA-&gt;&gt;API: POST /api/orders (Payload + JWT Token)</w:t>
+      </w:r>
+      <w:r>
+        <w:br/>
+      </w:r>
+      <w:r>
+        <w:rPr>
+          <w:rStyle w:val="VerbatimChar"/>
+        </w:rPr>
+        <w:t xml:space="preserve">    API-&gt;&gt;API: Valida autenticación y schema de datos</w:t>
+      </w:r>
+      <w:r>
+        <w:br/>
+      </w:r>
+      <w:r>
+        <w:rPr>
+          <w:rStyle w:val="VerbatimChar"/>
+        </w:rPr>
+        <w:t xml:space="preserve">    API-&gt;&gt;Service: createOrder(orderData)</w:t>
+      </w:r>
+      <w:r>
+        <w:br/>
+      </w:r>
+      <w:r>
+        <w:rPr>
+          <w:rStyle w:val="VerbatimChar"/>
+        </w:rPr>
+        <w:t xml:space="preserve">    </w:t>
+      </w:r>
+      <w:r>
+        <w:br/>
+      </w:r>
+      <w:r>
+        <w:rPr>
+          <w:rStyle w:val="VerbatimChar"/>
+        </w:rPr>
+        <w:t xml:space="preserve">    rect rgb(240, 248, 255)</w:t>
+      </w:r>
+      <w:r>
+        <w:br/>
+      </w:r>
+      <w:r>
+        <w:rPr>
+          <w:rStyle w:val="VerbatimChar"/>
+        </w:rPr>
+        <w:t xml:space="preserve">        note right of Service: Inicio de Transacción ACID</w:t>
+      </w:r>
+      <w:r>
+        <w:br/>
+      </w:r>
+      <w:r>
+        <w:rPr>
+          <w:rStyle w:val="VerbatimChar"/>
+        </w:rPr>
+        <w:t xml:space="preserve">        Service-&gt;&gt;DB: BEGIN TRANSACTION</w:t>
+      </w:r>
+      <w:r>
+        <w:br/>
+      </w:r>
+      <w:r>
+        <w:rPr>
+          <w:rStyle w:val="VerbatimChar"/>
+        </w:rPr>
+        <w:t xml:space="preserve">        Service-&gt;&gt;DB: SELECT stock FROM product_variants WHERE id IN (...) FOR UPDATE</w:t>
+      </w:r>
+      <w:r>
+        <w:br/>
+      </w:r>
+      <w:r>
+        <w:rPr>
+          <w:rStyle w:val="VerbatimChar"/>
+        </w:rPr>
+        <w:t xml:space="preserve">        </w:t>
+      </w:r>
+      <w:r>
+        <w:br/>
+      </w:r>
+      <w:r>
+        <w:rPr>
+          <w:rStyle w:val="VerbatimChar"/>
+        </w:rPr>
+        <w:t xml:space="preserve">        alt Stock Insuficiente en alguna variante</w:t>
+      </w:r>
+      <w:r>
+        <w:br/>
+      </w:r>
+      <w:r>
+        <w:rPr>
+          <w:rStyle w:val="VerbatimChar"/>
+        </w:rPr>
+        <w:t xml:space="preserve">            DB--&gt;&gt;Service: Existencias &lt; Unidades solicitadas</w:t>
+      </w:r>
+      <w:r>
+        <w:br/>
+      </w:r>
+      <w:r>
+        <w:rPr>
+          <w:rStyle w:val="VerbatimChar"/>
+        </w:rPr>
+        <w:t xml:space="preserve">            Service-&gt;&gt;DB: ROLLBACK TRANSACTION</w:t>
+      </w:r>
+      <w:r>
+        <w:br/>
+      </w:r>
+      <w:r>
+        <w:rPr>
+          <w:rStyle w:val="VerbatimChar"/>
+        </w:rPr>
+        <w:t xml:space="preserve">            Service--&gt;&gt;API: Error: Stock Insuficiente</w:t>
+      </w:r>
+      <w:r>
+        <w:br/>
+      </w:r>
+      <w:r>
+        <w:rPr>
+          <w:rStyle w:val="VerbatimChar"/>
+        </w:rPr>
+        <w:t xml:space="preserve">            API--&gt;&gt;PWA: 409 Conflict (Detalle de prenda sin stock)</w:t>
+      </w:r>
+      <w:r>
+        <w:br/>
+      </w:r>
+      <w:r>
+        <w:rPr>
+          <w:rStyle w:val="VerbatimChar"/>
+        </w:rPr>
+        <w:t xml:space="preserve">            PWA--&gt;&gt;Operador: Alerta visual de stock no disponible</w:t>
+      </w:r>
+      <w:r>
+        <w:br/>
+      </w:r>
+      <w:r>
+        <w:rPr>
+          <w:rStyle w:val="VerbatimChar"/>
+        </w:rPr>
+        <w:t xml:space="preserve">        else Stock Disponible</w:t>
+      </w:r>
+      <w:r>
+        <w:br/>
+      </w:r>
+      <w:r>
+        <w:rPr>
+          <w:rStyle w:val="VerbatimChar"/>
+        </w:rPr>
+        <w:t xml:space="preserve">            DB--&gt;&gt;Service: Existencias verificadas</w:t>
+      </w:r>
+      <w:r>
+        <w:br/>
+      </w:r>
+      <w:r>
+        <w:rPr>
+          <w:rStyle w:val="VerbatimChar"/>
+        </w:rPr>
+        <w:t xml:space="preserve">            Service-&gt;&gt;DB: UPDATE product_variants SET stock = stock - qty WHERE id = ...</w:t>
+      </w:r>
+      <w:r>
+        <w:br/>
+      </w:r>
+      <w:r>
+        <w:rPr>
+          <w:rStyle w:val="VerbatimChar"/>
+        </w:rPr>
+        <w:t xml:space="preserve">            Service-&gt;&gt;DB: INSERT INTO orders (order_number, client_id, total, status, ...)</w:t>
+      </w:r>
+      <w:r>
+        <w:br/>
+      </w:r>
+      <w:r>
+        <w:rPr>
+          <w:rStyle w:val="VerbatimChar"/>
+        </w:rPr>
+        <w:t xml:space="preserve">            Service-&gt;&gt;DB: INSERT INTO order_items (order_id, variant_id, qty, unit_price, ...)</w:t>
+      </w:r>
+      <w:r>
+        <w:br/>
+      </w:r>
+      <w:r>
+        <w:rPr>
+          <w:rStyle w:val="VerbatimChar"/>
+        </w:rPr>
+        <w:t xml:space="preserve">            Service-&gt;&gt;DB: INSERT INTO order_status_history (order_id, status, changed_at, ...)</w:t>
+      </w:r>
+      <w:r>
+        <w:br/>
+      </w:r>
+      <w:r>
+        <w:rPr>
+          <w:rStyle w:val="VerbatimChar"/>
+        </w:rPr>
+        <w:t xml:space="preserve">            Service-&gt;&gt;DB: COMMIT TRANSACTION</w:t>
+      </w:r>
+      <w:r>
+        <w:br/>
+      </w:r>
+      <w:r>
+        <w:rPr>
+          <w:rStyle w:val="VerbatimChar"/>
+        </w:rPr>
+        <w:t xml:space="preserve">            note right of Service: Transacción Completada con Éxito</w:t>
+      </w:r>
+      <w:r>
+        <w:br/>
+      </w:r>
+      <w:r>
+        <w:rPr>
+          <w:rStyle w:val="VerbatimChar"/>
+        </w:rPr>
+        <w:t xml:space="preserve">            Service--&gt;&gt;API: Orden creada satisfactoriamente</w:t>
+      </w:r>
+      <w:r>
+        <w:br/>
+      </w:r>
+      <w:r>
+        <w:rPr>
+          <w:rStyle w:val="VerbatimChar"/>
+        </w:rPr>
+        <w:t xml:space="preserve">            API--&gt;&gt;PWA: 201 Created (Order Object + Ticket Formateado)</w:t>
+      </w:r>
+      <w:r>
+        <w:br/>
+      </w:r>
+      <w:r>
+        <w:rPr>
+          <w:rStyle w:val="VerbatimChar"/>
+        </w:rPr>
+        <w:t xml:space="preserve">            PWA--&gt;&gt;Operador: Notificación de éxito y opción de compartir ticket WhatsApp</w:t>
+      </w:r>
+      <w:r>
+        <w:br/>
+      </w:r>
+      <w:r>
+        <w:rPr>
+          <w:rStyle w:val="VerbatimChar"/>
+        </w:rPr>
+        <w:t xml:space="preserve">        end</w:t>
+      </w:r>
+      <w:r>
+        <w:br/>
+      </w:r>
+      <w:r>
+        <w:rPr>
+          <w:rStyle w:val="VerbatimChar"/>
+        </w:rPr>
+        <w:t xml:space="preserve">    end</w:t>
       </w:r>
     </w:p>
     <w:p>
@@ -1844,21 +2146,13 @@
       </w:r>
     </w:p>
     <w:bookmarkEnd w:id="19"/>
-    <w:bookmarkStart w:id="20" w:name="X14d354a181e199a511cfe0a43f9c980e6532975"/>
+    <w:bookmarkStart w:id="20" w:name="X94054e8ca910bd43daafbf4284b2902b1219d8c"/>
     <w:p>
       <w:pPr>
         <w:pStyle w:val="Heading3"/>
       </w:pPr>
       <w:r>
-        <w:t xml:space="preserve">4.3. Vista de Desarrollo: Estructura Modular del Proyecto</w:t>
-      </w:r>
-    </w:p>
-    <w:p>
-      <w:pPr>
-        <w:pStyle w:val="FirstParagraph"/>
-      </w:pPr>
-      <w:r>
-        <w:t xml:space="preserve">La estructura del código fuente está organizada bajo una arquitectura modular y mantenible:</w:t>
+        <w:t xml:space="preserve">4.3. Máquina de Estados del Ciclo de Vida del Pedido</w:t>
       </w:r>
     </w:p>
     <w:p>
@@ -1869,196 +2163,133 @@
         <w:rPr>
           <w:rStyle w:val="VerbatimChar"/>
         </w:rPr>
-        <w:t xml:space="preserve">leofit-pedidos-sistema/</w:t>
-      </w:r>
-      <w:r>
-        <w:br/>
-      </w:r>
-      <w:r>
-        <w:rPr>
-          <w:rStyle w:val="VerbatimChar"/>
-        </w:rPr>
-        <w:t xml:space="preserve">├── package.json               # Configuración raíz de scripts y workspaces de ejecución</w:t>
-      </w:r>
-      <w:r>
-        <w:br/>
-      </w:r>
-      <w:r>
-        <w:rPr>
-          <w:rStyle w:val="VerbatimChar"/>
-        </w:rPr>
-        <w:t xml:space="preserve">├── index.html                 # Punto de entrada SPA compilado para GitHub Pages</w:t>
-      </w:r>
-      <w:r>
-        <w:br/>
-      </w:r>
-      <w:r>
-        <w:rPr>
-          <w:rStyle w:val="VerbatimChar"/>
-        </w:rPr>
-        <w:t xml:space="preserve">├── assets/                    # Bundle optimizado de JavaScript (257 KB) y CSS (32 KB)</w:t>
-      </w:r>
-      <w:r>
-        <w:br/>
-      </w:r>
-      <w:r>
-        <w:rPr>
-          <w:rStyle w:val="VerbatimChar"/>
-        </w:rPr>
-        <w:t xml:space="preserve">├── docs/                      # Documentación formal (SAD, ERS, Glosario, Ficha, Actas)</w:t>
-      </w:r>
-      <w:r>
-        <w:br/>
-      </w:r>
-      <w:r>
-        <w:rPr>
-          <w:rStyle w:val="VerbatimChar"/>
-        </w:rPr>
-        <w:t xml:space="preserve">├── diagrams/                  # Diagramas de arquitectura, BPMN, riesgos y matriz RF/RNF</w:t>
-      </w:r>
-      <w:r>
-        <w:br/>
-      </w:r>
-      <w:r>
-        <w:rPr>
-          <w:rStyle w:val="VerbatimChar"/>
-        </w:rPr>
-        <w:t xml:space="preserve">├── database/                  # Modelo Entidad-Relación, esquemas y scripts SQL</w:t>
-      </w:r>
-      <w:r>
-        <w:br/>
-      </w:r>
-      <w:r>
-        <w:rPr>
-          <w:rStyle w:val="VerbatimChar"/>
-        </w:rPr>
-        <w:t xml:space="preserve">├── backend/                   # Arquitectura y diseño de la API REST Node.js/Express</w:t>
-      </w:r>
-      <w:r>
-        <w:br/>
-      </w:r>
-      <w:r>
-        <w:rPr>
-          <w:rStyle w:val="VerbatimChar"/>
-        </w:rPr>
-        <w:t xml:space="preserve">├── frontend/                  # Código fuente de la aplicación cliente (React 19 + Vite)</w:t>
-      </w:r>
-      <w:r>
-        <w:br/>
-      </w:r>
-      <w:r>
-        <w:rPr>
-          <w:rStyle w:val="VerbatimChar"/>
-        </w:rPr>
-        <w:t xml:space="preserve">│   ├── public/                # Manifest PWA, iconos y manejador 404 SPA</w:t>
-      </w:r>
-      <w:r>
-        <w:br/>
-      </w:r>
-      <w:r>
-        <w:rPr>
-          <w:rStyle w:val="VerbatimChar"/>
-        </w:rPr>
-        <w:t xml:space="preserve">│   ├── src/</w:t>
-      </w:r>
-      <w:r>
-        <w:br/>
-      </w:r>
-      <w:r>
-        <w:rPr>
-          <w:rStyle w:val="VerbatimChar"/>
-        </w:rPr>
-        <w:t xml:space="preserve">│   │   ├── __tests__/         # Pruebas unitarias automatizadas con Vitest</w:t>
-      </w:r>
-      <w:r>
-        <w:br/>
-      </w:r>
-      <w:r>
-        <w:rPr>
-          <w:rStyle w:val="VerbatimChar"/>
-        </w:rPr>
-        <w:t xml:space="preserve">│   │   ├── components/        # Componentes reutilizables (Navbar, Badges, Modales)</w:t>
-      </w:r>
-      <w:r>
-        <w:br/>
-      </w:r>
-      <w:r>
-        <w:rPr>
-          <w:rStyle w:val="VerbatimChar"/>
-        </w:rPr>
-        <w:t xml:space="preserve">│   │   ├── context/           # AppContext (estado global, persistencia, roles)</w:t>
-      </w:r>
-      <w:r>
-        <w:br/>
-      </w:r>
-      <w:r>
-        <w:rPr>
-          <w:rStyle w:val="VerbatimChar"/>
-        </w:rPr>
-        <w:t xml:space="preserve">│   │   ├── data/              # Modelos y mockData de inicialización</w:t>
-      </w:r>
-      <w:r>
-        <w:br/>
-      </w:r>
-      <w:r>
-        <w:rPr>
-          <w:rStyle w:val="VerbatimChar"/>
-        </w:rPr>
-        <w:t xml:space="preserve">│   │   ├── pages/             # Vistas de Login, Dashboard, Pedidos e Inventario</w:t>
-      </w:r>
-      <w:r>
-        <w:br/>
-      </w:r>
-      <w:r>
-        <w:rPr>
-          <w:rStyle w:val="VerbatimChar"/>
-        </w:rPr>
-        <w:t xml:space="preserve">│   │   ├── types/             # Definiciones e interfaces estrictas de TypeScript</w:t>
-      </w:r>
-      <w:r>
-        <w:br/>
-      </w:r>
-      <w:r>
-        <w:rPr>
-          <w:rStyle w:val="VerbatimChar"/>
-        </w:rPr>
-        <w:t xml:space="preserve">│   │   ├── App.tsx            # Enrutador principal de la aplicación</w:t>
-      </w:r>
-      <w:r>
-        <w:br/>
-      </w:r>
-      <w:r>
-        <w:rPr>
-          <w:rStyle w:val="VerbatimChar"/>
-        </w:rPr>
-        <w:t xml:space="preserve">│   │   └── main.tsx           # Punto de montaje React DOM</w:t>
-      </w:r>
-      <w:r>
-        <w:br/>
-      </w:r>
-      <w:r>
-        <w:rPr>
-          <w:rStyle w:val="VerbatimChar"/>
-        </w:rPr>
-        <w:t xml:space="preserve">│   ├── package.json           # Dependencias frontend (React 19, TailwindCSS, Vitest)</w:t>
-      </w:r>
-      <w:r>
-        <w:br/>
-      </w:r>
-      <w:r>
-        <w:rPr>
-          <w:rStyle w:val="VerbatimChar"/>
-        </w:rPr>
-        <w:t xml:space="preserve">│   └── vite.config.ts         # Configuración del bundler y ruta base de despliegue</w:t>
-      </w:r>
-      <w:r>
-        <w:br/>
-      </w:r>
-      <w:r>
-        <w:rPr>
-          <w:rStyle w:val="VerbatimChar"/>
-        </w:rPr>
-        <w:t xml:space="preserve">└── .github/workflows/         # Pipelines CI/CD (Deploy a Pages + Security Scan)</w:t>
+        <w:t xml:space="preserve">stateDiagram-v2</w:t>
+      </w:r>
+      <w:r>
+        <w:br/>
+      </w:r>
+      <w:r>
+        <w:rPr>
+          <w:rStyle w:val="VerbatimChar"/>
+        </w:rPr>
+        <w:t xml:space="preserve">    [*] --&gt; RECIBIDO: Registro de Pedido por WhatsApp/Llamada/Local</w:t>
+      </w:r>
+      <w:r>
+        <w:br/>
+      </w:r>
+      <w:r>
+        <w:rPr>
+          <w:rStyle w:val="VerbatimChar"/>
+        </w:rPr>
+        <w:t xml:space="preserve">    </w:t>
+      </w:r>
+      <w:r>
+        <w:br/>
+      </w:r>
+      <w:r>
+        <w:rPr>
+          <w:rStyle w:val="VerbatimChar"/>
+        </w:rPr>
+        <w:t xml:space="preserve">    RECIBIDO --&gt; PREPARACION: Confirmación de Pago &amp; Inicio de Empaque</w:t>
+      </w:r>
+      <w:r>
+        <w:br/>
+      </w:r>
+      <w:r>
+        <w:rPr>
+          <w:rStyle w:val="VerbatimChar"/>
+        </w:rPr>
+        <w:t xml:space="preserve">    RECIBIDO --&gt; CANCELADO: Cliente Desiste / Inconsistencia de Pago</w:t>
+      </w:r>
+      <w:r>
+        <w:br/>
+      </w:r>
+      <w:r>
+        <w:rPr>
+          <w:rStyle w:val="VerbatimChar"/>
+        </w:rPr>
+        <w:t xml:space="preserve">    </w:t>
+      </w:r>
+      <w:r>
+        <w:br/>
+      </w:r>
+      <w:r>
+        <w:rPr>
+          <w:rStyle w:val="VerbatimChar"/>
+        </w:rPr>
+        <w:t xml:space="preserve">    PREPARACION --&gt; EN_CAMINO: Asignación a Motorizado / Courier</w:t>
+      </w:r>
+      <w:r>
+        <w:br/>
+      </w:r>
+      <w:r>
+        <w:rPr>
+          <w:rStyle w:val="VerbatimChar"/>
+        </w:rPr>
+        <w:t xml:space="preserve">    PREPARACION --&gt; CANCELADO: Incidencia Crítica en Taller</w:t>
+      </w:r>
+      <w:r>
+        <w:br/>
+      </w:r>
+      <w:r>
+        <w:rPr>
+          <w:rStyle w:val="VerbatimChar"/>
+        </w:rPr>
+        <w:t xml:space="preserve">    </w:t>
+      </w:r>
+      <w:r>
+        <w:br/>
+      </w:r>
+      <w:r>
+        <w:rPr>
+          <w:rStyle w:val="VerbatimChar"/>
+        </w:rPr>
+        <w:t xml:space="preserve">    EN_CAMINO --&gt; ENTREGADO: Confirmación de Recepción por Cliente</w:t>
+      </w:r>
+      <w:r>
+        <w:br/>
+      </w:r>
+      <w:r>
+        <w:rPr>
+          <w:rStyle w:val="VerbatimChar"/>
+        </w:rPr>
+        <w:t xml:space="preserve">    EN_CAMINO --&gt; PREPARACION: Reintento de Entrega por Dirección Errónea</w:t>
+      </w:r>
+      <w:r>
+        <w:br/>
+      </w:r>
+      <w:r>
+        <w:rPr>
+          <w:rStyle w:val="VerbatimChar"/>
+        </w:rPr>
+        <w:t xml:space="preserve">    </w:t>
+      </w:r>
+      <w:r>
+        <w:br/>
+      </w:r>
+      <w:r>
+        <w:rPr>
+          <w:rStyle w:val="VerbatimChar"/>
+        </w:rPr>
+        <w:t xml:space="preserve">    ENTREGADO --&gt; [*]: Pedido Cerrado con Éxito</w:t>
+      </w:r>
+      <w:r>
+        <w:br/>
+      </w:r>
+      <w:r>
+        <w:rPr>
+          <w:rStyle w:val="VerbatimChar"/>
+        </w:rPr>
+        <w:t xml:space="preserve">    </w:t>
+      </w:r>
+      <w:r>
+        <w:br/>
+      </w:r>
+      <w:r>
+        <w:rPr>
+          <w:rStyle w:val="VerbatimChar"/>
+        </w:rPr>
+        <w:t xml:space="preserve">    CANCELADO --&gt; [*]: Reposición Automática de Stock en Almacén</w:t>
       </w:r>
     </w:p>
     <w:p>
@@ -2069,13 +2300,13 @@
       </w:r>
     </w:p>
     <w:bookmarkEnd w:id="20"/>
-    <w:bookmarkStart w:id="21" w:name="X982f27c5d697c19edd7960dbdf7c01f2f118b30"/>
+    <w:bookmarkStart w:id="21" w:name="X7c423164d9d7495b5f9fd19dc307fc6174943d2"/>
     <w:p>
       <w:pPr>
         <w:pStyle w:val="Heading3"/>
       </w:pPr>
       <w:r>
-        <w:t xml:space="preserve">4.4. Vista Física / Despliegue (Topología de Infraestructura)</w:t>
+        <w:t xml:space="preserve">4.4. Vista Física / Topología de Despliegue en Producción</w:t>
       </w:r>
     </w:p>
     <w:p>
@@ -2086,286 +2317,199 @@
         <w:rPr>
           <w:rStyle w:val="VerbatimChar"/>
         </w:rPr>
-        <w:t xml:space="preserve">                            ┌────────────────────────┐</w:t>
-      </w:r>
-      <w:r>
-        <w:br/>
-      </w:r>
-      <w:r>
-        <w:rPr>
-          <w:rStyle w:val="VerbatimChar"/>
-        </w:rPr>
-        <w:t xml:space="preserve">                            │   DISPOSITIVO USUARIO  │</w:t>
-      </w:r>
-      <w:r>
-        <w:br/>
-      </w:r>
-      <w:r>
-        <w:rPr>
-          <w:rStyle w:val="VerbatimChar"/>
-        </w:rPr>
-        <w:t xml:space="preserve">                            │   (Móvil / Escritorio) │</w:t>
-      </w:r>
-      <w:r>
-        <w:br/>
-      </w:r>
-      <w:r>
-        <w:rPr>
-          <w:rStyle w:val="VerbatimChar"/>
-        </w:rPr>
-        <w:t xml:space="preserve">                            └───────────┬────────────┘</w:t>
-      </w:r>
-      <w:r>
-        <w:br/>
-      </w:r>
-      <w:r>
-        <w:rPr>
-          <w:rStyle w:val="VerbatimChar"/>
-        </w:rPr>
-        <w:t xml:space="preserve">                                        │</w:t>
-      </w:r>
-      <w:r>
-        <w:br/>
-      </w:r>
-      <w:r>
-        <w:rPr>
-          <w:rStyle w:val="VerbatimChar"/>
-        </w:rPr>
-        <w:t xml:space="preserve">                                        │ HTTPS / TLS 1.3</w:t>
-      </w:r>
-      <w:r>
-        <w:br/>
-      </w:r>
-      <w:r>
-        <w:rPr>
-          <w:rStyle w:val="VerbatimChar"/>
-        </w:rPr>
-        <w:t xml:space="preserve">                                        ▼</w:t>
-      </w:r>
-      <w:r>
-        <w:br/>
-      </w:r>
-      <w:r>
-        <w:rPr>
-          <w:rStyle w:val="VerbatimChar"/>
-        </w:rPr>
-        <w:t xml:space="preserve">                            ┌────────────────────────┐</w:t>
-      </w:r>
-      <w:r>
-        <w:br/>
-      </w:r>
-      <w:r>
-        <w:rPr>
-          <w:rStyle w:val="VerbatimChar"/>
-        </w:rPr>
-        <w:t xml:space="preserve">                            │    CDN / GITHUB PAGES  │</w:t>
-      </w:r>
-      <w:r>
-        <w:br/>
-      </w:r>
-      <w:r>
-        <w:rPr>
-          <w:rStyle w:val="VerbatimChar"/>
-        </w:rPr>
-        <w:t xml:space="preserve">                            │  (Assets Estáticos PWA)│</w:t>
-      </w:r>
-      <w:r>
-        <w:br/>
-      </w:r>
-      <w:r>
-        <w:rPr>
-          <w:rStyle w:val="VerbatimChar"/>
-        </w:rPr>
-        <w:t xml:space="preserve">                            └───────────┬────────────┘</w:t>
-      </w:r>
-      <w:r>
-        <w:br/>
-      </w:r>
-      <w:r>
-        <w:rPr>
-          <w:rStyle w:val="VerbatimChar"/>
-        </w:rPr>
-        <w:t xml:space="preserve">                                        │</w:t>
-      </w:r>
-      <w:r>
-        <w:br/>
-      </w:r>
-      <w:r>
-        <w:rPr>
-          <w:rStyle w:val="VerbatimChar"/>
-        </w:rPr>
-        <w:t xml:space="preserve">                                        │ REST API (JSON)</w:t>
-      </w:r>
-      <w:r>
-        <w:br/>
-      </w:r>
-      <w:r>
-        <w:rPr>
-          <w:rStyle w:val="VerbatimChar"/>
-        </w:rPr>
-        <w:t xml:space="preserve">                                        ▼</w:t>
-      </w:r>
-      <w:r>
-        <w:br/>
-      </w:r>
-      <w:r>
-        <w:rPr>
-          <w:rStyle w:val="VerbatimChar"/>
-        </w:rPr>
-        <w:t xml:space="preserve">                            ┌────────────────────────┐</w:t>
-      </w:r>
-      <w:r>
-        <w:br/>
-      </w:r>
-      <w:r>
-        <w:rPr>
-          <w:rStyle w:val="VerbatimChar"/>
-        </w:rPr>
-        <w:t xml:space="preserve">                            │    REVERSE PROXY       │</w:t>
-      </w:r>
-      <w:r>
-        <w:br/>
-      </w:r>
-      <w:r>
-        <w:rPr>
-          <w:rStyle w:val="VerbatimChar"/>
-        </w:rPr>
-        <w:t xml:space="preserve">                            │    (Nginx / Cloudflare)│</w:t>
-      </w:r>
-      <w:r>
-        <w:br/>
-      </w:r>
-      <w:r>
-        <w:rPr>
-          <w:rStyle w:val="VerbatimChar"/>
-        </w:rPr>
-        <w:t xml:space="preserve">                            └───────────┬────────────┘</w:t>
-      </w:r>
-      <w:r>
-        <w:br/>
-      </w:r>
-      <w:r>
-        <w:rPr>
-          <w:rStyle w:val="VerbatimChar"/>
-        </w:rPr>
-        <w:t xml:space="preserve">                                        │</w:t>
-      </w:r>
-      <w:r>
-        <w:br/>
-      </w:r>
-      <w:r>
-        <w:rPr>
-          <w:rStyle w:val="VerbatimChar"/>
-        </w:rPr>
-        <w:t xml:space="preserve">                                        ▼</w:t>
-      </w:r>
-      <w:r>
-        <w:br/>
-      </w:r>
-      <w:r>
-        <w:rPr>
-          <w:rStyle w:val="VerbatimChar"/>
-        </w:rPr>
-        <w:t xml:space="preserve">                            ┌────────────────────────┐</w:t>
-      </w:r>
-      <w:r>
-        <w:br/>
-      </w:r>
-      <w:r>
-        <w:rPr>
-          <w:rStyle w:val="VerbatimChar"/>
-        </w:rPr>
-        <w:t xml:space="preserve">                            │  APP SERVER (NODE.JS)  │</w:t>
-      </w:r>
-      <w:r>
-        <w:br/>
-      </w:r>
-      <w:r>
-        <w:rPr>
-          <w:rStyle w:val="VerbatimChar"/>
-        </w:rPr>
-        <w:t xml:space="preserve">                            │  Runtime Docker/PaaS   │</w:t>
-      </w:r>
-      <w:r>
-        <w:br/>
-      </w:r>
-      <w:r>
-        <w:rPr>
-          <w:rStyle w:val="VerbatimChar"/>
-        </w:rPr>
-        <w:t xml:space="preserve">                            │  (Express + API REST)  │</w:t>
-      </w:r>
-      <w:r>
-        <w:br/>
-      </w:r>
-      <w:r>
-        <w:rPr>
-          <w:rStyle w:val="VerbatimChar"/>
-        </w:rPr>
-        <w:t xml:space="preserve">                            └───────────┬────────────┘</w:t>
-      </w:r>
-      <w:r>
-        <w:br/>
-      </w:r>
-      <w:r>
-        <w:rPr>
-          <w:rStyle w:val="VerbatimChar"/>
-        </w:rPr>
-        <w:t xml:space="preserve">                                        │ Connection Pool (SSL)</w:t>
-      </w:r>
-      <w:r>
-        <w:br/>
-      </w:r>
-      <w:r>
-        <w:rPr>
-          <w:rStyle w:val="VerbatimChar"/>
-        </w:rPr>
-        <w:t xml:space="preserve">                                        ▼</w:t>
-      </w:r>
-      <w:r>
-        <w:br/>
-      </w:r>
-      <w:r>
-        <w:rPr>
-          <w:rStyle w:val="VerbatimChar"/>
-        </w:rPr>
-        <w:t xml:space="preserve">                            ┌────────────────────────┐</w:t>
-      </w:r>
-      <w:r>
-        <w:br/>
-      </w:r>
-      <w:r>
-        <w:rPr>
-          <w:rStyle w:val="VerbatimChar"/>
-        </w:rPr>
-        <w:t xml:space="preserve">                            │    MANAGED DATABASE    │</w:t>
-      </w:r>
-      <w:r>
-        <w:br/>
-      </w:r>
-      <w:r>
-        <w:rPr>
-          <w:rStyle w:val="VerbatimChar"/>
-        </w:rPr>
-        <w:t xml:space="preserve">                            │  (PostgreSQL / MySQL)  │</w:t>
-      </w:r>
-      <w:r>
-        <w:br/>
-      </w:r>
-      <w:r>
-        <w:rPr>
-          <w:rStyle w:val="VerbatimChar"/>
-        </w:rPr>
-        <w:t xml:space="preserve">                            │  Multi-AZ + Backups    │</w:t>
-      </w:r>
-      <w:r>
-        <w:br/>
-      </w:r>
-      <w:r>
-        <w:rPr>
-          <w:rStyle w:val="VerbatimChar"/>
-        </w:rPr>
-        <w:t xml:space="preserve">                            └────────────────────────┘</w:t>
+        <w:t xml:space="preserve">flowchart LR</w:t>
+      </w:r>
+      <w:r>
+        <w:br/>
+      </w:r>
+      <w:r>
+        <w:rPr>
+          <w:rStyle w:val="VerbatimChar"/>
+        </w:rPr>
+        <w:t xml:space="preserve">    subgraph Clientes ["Dispositivos Clientes"]</w:t>
+      </w:r>
+      <w:r>
+        <w:br/>
+      </w:r>
+      <w:r>
+        <w:rPr>
+          <w:rStyle w:val="VerbatimChar"/>
+        </w:rPr>
+        <w:t xml:space="preserve">        Mobile["Smartphone Android / iOS\n(PWA Instalada)"]</w:t>
+      </w:r>
+      <w:r>
+        <w:br/>
+      </w:r>
+      <w:r>
+        <w:rPr>
+          <w:rStyle w:val="VerbatimChar"/>
+        </w:rPr>
+        <w:t xml:space="preserve">        Desktop["Navegador Web Desktop\n(Panel Administrativo)"]</w:t>
+      </w:r>
+      <w:r>
+        <w:br/>
+      </w:r>
+      <w:r>
+        <w:rPr>
+          <w:rStyle w:val="VerbatimChar"/>
+        </w:rPr>
+        <w:t xml:space="preserve">    end</w:t>
+      </w:r>
+      <w:r>
+        <w:br/>
+      </w:r>
+      <w:r>
+        <w:br/>
+      </w:r>
+      <w:r>
+        <w:rPr>
+          <w:rStyle w:val="VerbatimChar"/>
+        </w:rPr>
+        <w:t xml:space="preserve">    subgraph CDN ["Red de Distribución (Edge / CDN)"]</w:t>
+      </w:r>
+      <w:r>
+        <w:br/>
+      </w:r>
+      <w:r>
+        <w:rPr>
+          <w:rStyle w:val="VerbatimChar"/>
+        </w:rPr>
+        <w:t xml:space="preserve">        GHPages["GitHub Pages / Vercel CDN\n(HTML5, CSS3, JS Bundles)"]</w:t>
+      </w:r>
+      <w:r>
+        <w:br/>
+      </w:r>
+      <w:r>
+        <w:rPr>
+          <w:rStyle w:val="VerbatimChar"/>
+        </w:rPr>
+        <w:t xml:space="preserve">    end</w:t>
+      </w:r>
+      <w:r>
+        <w:br/>
+      </w:r>
+      <w:r>
+        <w:br/>
+      </w:r>
+      <w:r>
+        <w:rPr>
+          <w:rStyle w:val="VerbatimChar"/>
+        </w:rPr>
+        <w:t xml:space="preserve">    subgraph CloudApp ["Capa de Aplicación Cloud (PaaS)"]</w:t>
+      </w:r>
+      <w:r>
+        <w:br/>
+      </w:r>
+      <w:r>
+        <w:rPr>
+          <w:rStyle w:val="VerbatimChar"/>
+        </w:rPr>
+        <w:t xml:space="preserve">        ReverseProxy["Reverse Proxy / SSL TLS 1.3\n(Cloudflare / Nginx)"]</w:t>
+      </w:r>
+      <w:r>
+        <w:br/>
+      </w:r>
+      <w:r>
+        <w:rPr>
+          <w:rStyle w:val="VerbatimChar"/>
+        </w:rPr>
+        <w:t xml:space="preserve">        NodeRuntime["Node.js 22 LTS Runtime\n(Express REST API Server)"]</w:t>
+      </w:r>
+      <w:r>
+        <w:br/>
+      </w:r>
+      <w:r>
+        <w:rPr>
+          <w:rStyle w:val="VerbatimChar"/>
+        </w:rPr>
+        <w:t xml:space="preserve">        ReverseProxy --&gt; NodeRuntime</w:t>
+      </w:r>
+      <w:r>
+        <w:br/>
+      </w:r>
+      <w:r>
+        <w:rPr>
+          <w:rStyle w:val="VerbatimChar"/>
+        </w:rPr>
+        <w:t xml:space="preserve">    end</w:t>
+      </w:r>
+      <w:r>
+        <w:br/>
+      </w:r>
+      <w:r>
+        <w:br/>
+      </w:r>
+      <w:r>
+        <w:rPr>
+          <w:rStyle w:val="VerbatimChar"/>
+        </w:rPr>
+        <w:t xml:space="preserve">    subgraph CloudDB ["Persistencia Gestionada"]</w:t>
+      </w:r>
+      <w:r>
+        <w:br/>
+      </w:r>
+      <w:r>
+        <w:rPr>
+          <w:rStyle w:val="VerbatimChar"/>
+        </w:rPr>
+        <w:t xml:space="preserve">        SQLDB[(Managed PostgreSQL / MySQL\nPool de Conexiones + Backups Diarios)]</w:t>
+      </w:r>
+      <w:r>
+        <w:br/>
+      </w:r>
+      <w:r>
+        <w:rPr>
+          <w:rStyle w:val="VerbatimChar"/>
+        </w:rPr>
+        <w:t xml:space="preserve">    end</w:t>
+      </w:r>
+      <w:r>
+        <w:br/>
+      </w:r>
+      <w:r>
+        <w:br/>
+      </w:r>
+      <w:r>
+        <w:rPr>
+          <w:rStyle w:val="VerbatimChar"/>
+        </w:rPr>
+        <w:t xml:space="preserve">    Mobile -- "HTTPS" --&gt; GHPages</w:t>
+      </w:r>
+      <w:r>
+        <w:br/>
+      </w:r>
+      <w:r>
+        <w:rPr>
+          <w:rStyle w:val="VerbatimChar"/>
+        </w:rPr>
+        <w:t xml:space="preserve">    Desktop -- "HTTPS" --&gt; GHPages</w:t>
+      </w:r>
+      <w:r>
+        <w:br/>
+      </w:r>
+      <w:r>
+        <w:rPr>
+          <w:rStyle w:val="VerbatimChar"/>
+        </w:rPr>
+        <w:t xml:space="preserve">    Mobile -- "REST API (JSON / HTTPS)" --&gt; ReverseProxy</w:t>
+      </w:r>
+      <w:r>
+        <w:br/>
+      </w:r>
+      <w:r>
+        <w:rPr>
+          <w:rStyle w:val="VerbatimChar"/>
+        </w:rPr>
+        <w:t xml:space="preserve">    Desktop -- "REST API (JSON / HTTPS)" --&gt; ReverseProxy</w:t>
+      </w:r>
+      <w:r>
+        <w:br/>
+      </w:r>
+      <w:r>
+        <w:rPr>
+          <w:rStyle w:val="VerbatimChar"/>
+        </w:rPr>
+        <w:t xml:space="preserve">    NodeRuntime -- "Encrypted TCP / SSL" --&gt; SQLDB</w:t>
       </w:r>
     </w:p>
     <w:p>
@@ -2376,468 +2520,725 @@
       </w:r>
     </w:p>
     <w:bookmarkEnd w:id="21"/>
-    <w:bookmarkStart w:id="22" w:name="X6f3348ada711ee6f1b6b7b5e0c8a6b833de7157"/>
+    <w:bookmarkStart w:id="22" w:name="Xd0f29a9a35244370cbe960a9834b5ff0f89b9a0"/>
     <w:p>
       <w:pPr>
         <w:pStyle w:val="Heading3"/>
       </w:pPr>
       <w:r>
-        <w:t xml:space="preserve">4.5. Vista de Escenarios (+1 Casos de Uso Críticos)</w:t>
-      </w:r>
-    </w:p>
-    <w:tbl>
-      <w:tblPr>
-        <w:tblStyle w:val="Table"/>
-        <w:tblW w:type="pct" w:w="5000"/>
-        <w:tblLayout w:type="fixed"/>
-        <w:tblLook w:firstRow="1" w:lastRow="0" w:firstColumn="0" w:lastColumn="0" w:noHBand="0" w:noVBand="0" w:val="0020"/>
-      </w:tblPr>
-      <w:tblGrid>
-        <w:gridCol w:w="2640"/>
-        <w:gridCol w:w="2640"/>
-        <w:gridCol w:w="2640"/>
-      </w:tblGrid>
-      <w:tr>
-        <w:trPr>
-          <w:tblHeader w:val="on"/>
-        </w:trPr>
-        <w:tc>
-          <w:tcPr/>
-          <w:p>
-            <w:pPr>
-              <w:pStyle w:val="Compact"/>
-              <w:jc w:val="left"/>
-            </w:pPr>
-            <w:r>
-              <w:t xml:space="preserve">Caso de Uso</w:t>
-            </w:r>
-          </w:p>
-        </w:tc>
-        <w:tc>
-          <w:tcPr/>
-          <w:p>
-            <w:pPr>
-              <w:pStyle w:val="Compact"/>
-              <w:jc w:val="left"/>
-            </w:pPr>
-            <w:r>
-              <w:t xml:space="preserve">Realización Arquitectónica</w:t>
-            </w:r>
-          </w:p>
-        </w:tc>
-        <w:tc>
-          <w:tcPr/>
-          <w:p>
-            <w:pPr>
-              <w:pStyle w:val="Compact"/>
-              <w:jc w:val="left"/>
-            </w:pPr>
-            <w:r>
-              <w:t xml:space="preserve">Componentes Involucrados</w:t>
-            </w:r>
-          </w:p>
-        </w:tc>
-      </w:tr>
-      <w:tr>
-        <w:tc>
-          <w:tcPr/>
-          <w:p>
-            <w:pPr>
-              <w:pStyle w:val="Compact"/>
-              <w:jc w:val="left"/>
-            </w:pPr>
-            <w:r>
-              <w:rPr>
-                <w:b/>
-                <w:bCs/>
-              </w:rPr>
-              <w:t xml:space="preserve">CU-01: Autenticación con Roles</w:t>
-            </w:r>
-          </w:p>
-        </w:tc>
-        <w:tc>
-          <w:tcPr/>
-          <w:p>
-            <w:pPr>
-              <w:pStyle w:val="Compact"/>
-              <w:jc w:val="left"/>
-            </w:pPr>
-            <w:r>
-              <w:t xml:space="preserve">Verificación de credenciales con hash Bcrypt; generación de token JWT con expiración; renderizado condicional por rol (</w:t>
-            </w:r>
-            <w:r>
-              <w:rPr>
-                <w:rStyle w:val="VerbatimChar"/>
-              </w:rPr>
-              <w:t xml:space="preserve">Dueño</w:t>
-            </w:r>
-            <w:r>
-              <w:t xml:space="preserve"> </w:t>
-            </w:r>
-            <w:r>
-              <w:t xml:space="preserve">vs</w:t>
-            </w:r>
-            <w:r>
-              <w:t xml:space="preserve"> </w:t>
-            </w:r>
-            <w:r>
-              <w:rPr>
-                <w:rStyle w:val="VerbatimChar"/>
-              </w:rPr>
-              <w:t xml:space="preserve">Operador</w:t>
-            </w:r>
-            <w:r>
-              <w:t xml:space="preserve">).</w:t>
-            </w:r>
-          </w:p>
-        </w:tc>
-        <w:tc>
-          <w:tcPr/>
-          <w:p>
-            <w:pPr>
-              <w:pStyle w:val="Compact"/>
-              <w:jc w:val="left"/>
-            </w:pPr>
-            <w:r>
-              <w:rPr>
-                <w:rStyle w:val="VerbatimChar"/>
-              </w:rPr>
-              <w:t xml:space="preserve">AuthService</w:t>
-            </w:r>
-            <w:r>
-              <w:t xml:space="preserve">,</w:t>
-            </w:r>
-            <w:r>
-              <w:t xml:space="preserve"> </w:t>
-            </w:r>
-            <w:r>
-              <w:rPr>
-                <w:rStyle w:val="VerbatimChar"/>
-              </w:rPr>
-              <w:t xml:space="preserve">Login.tsx</w:t>
-            </w:r>
-            <w:r>
-              <w:t xml:space="preserve">,</w:t>
-            </w:r>
-            <w:r>
-              <w:t xml:space="preserve"> </w:t>
-            </w:r>
-            <w:r>
-              <w:rPr>
-                <w:rStyle w:val="VerbatimChar"/>
-              </w:rPr>
-              <w:t xml:space="preserve">AppContext</w:t>
-            </w:r>
-            <w:r>
-              <w:t xml:space="preserve">,</w:t>
-            </w:r>
-            <w:r>
-              <w:t xml:space="preserve"> </w:t>
-            </w:r>
-            <w:r>
-              <w:rPr>
-                <w:rStyle w:val="VerbatimChar"/>
-              </w:rPr>
-              <w:t xml:space="preserve">AuthGuardMiddleware</w:t>
-            </w:r>
-            <w:r>
-              <w:t xml:space="preserve">.</w:t>
-            </w:r>
-          </w:p>
-        </w:tc>
-      </w:tr>
-      <w:tr>
-        <w:tc>
-          <w:tcPr/>
-          <w:p>
-            <w:pPr>
-              <w:pStyle w:val="Compact"/>
-              <w:jc w:val="left"/>
-            </w:pPr>
-            <w:r>
-              <w:rPr>
-                <w:b/>
-                <w:bCs/>
-              </w:rPr>
-              <w:t xml:space="preserve">CU-02: Registro Ágil de Pedido</w:t>
-            </w:r>
-          </w:p>
-        </w:tc>
-        <w:tc>
-          <w:tcPr/>
-          <w:p>
-            <w:pPr>
-              <w:pStyle w:val="Compact"/>
-              <w:jc w:val="left"/>
-            </w:pPr>
-            <w:r>
-              <w:t xml:space="preserve">Cálculo reactivo de totales en cliente; petición POST atómica; validación de inventario en backend; decremento de stock; emisión de ticket formateado para WhatsApp.</w:t>
-            </w:r>
-          </w:p>
-        </w:tc>
-        <w:tc>
-          <w:tcPr/>
-          <w:p>
-            <w:pPr>
-              <w:pStyle w:val="Compact"/>
-              <w:jc w:val="left"/>
-            </w:pPr>
-            <w:r>
-              <w:rPr>
-                <w:rStyle w:val="VerbatimChar"/>
-              </w:rPr>
-              <w:t xml:space="preserve">PedidoForm.tsx</w:t>
-            </w:r>
-            <w:r>
-              <w:t xml:space="preserve">,</w:t>
-            </w:r>
-            <w:r>
-              <w:t xml:space="preserve"> </w:t>
-            </w:r>
-            <w:r>
-              <w:rPr>
-                <w:rStyle w:val="VerbatimChar"/>
-              </w:rPr>
-              <w:t xml:space="preserve">OrderController</w:t>
-            </w:r>
-            <w:r>
-              <w:t xml:space="preserve">,</w:t>
-            </w:r>
-            <w:r>
-              <w:t xml:space="preserve"> </w:t>
-            </w:r>
-            <w:r>
-              <w:rPr>
-                <w:rStyle w:val="VerbatimChar"/>
-              </w:rPr>
-              <w:t xml:space="preserve">InventoryEngine</w:t>
-            </w:r>
-            <w:r>
-              <w:t xml:space="preserve">,</w:t>
-            </w:r>
-            <w:r>
-              <w:t xml:space="preserve"> </w:t>
-            </w:r>
-            <w:r>
-              <w:rPr>
-                <w:rStyle w:val="VerbatimChar"/>
-              </w:rPr>
-              <w:t xml:space="preserve">database.orders</w:t>
-            </w:r>
-            <w:r>
-              <w:t xml:space="preserve">.</w:t>
-            </w:r>
-          </w:p>
-        </w:tc>
-      </w:tr>
-      <w:tr>
-        <w:tc>
-          <w:tcPr/>
-          <w:p>
-            <w:pPr>
-              <w:pStyle w:val="Compact"/>
-              <w:jc w:val="left"/>
-            </w:pPr>
-            <w:r>
-              <w:rPr>
-                <w:b/>
-                <w:bCs/>
-              </w:rPr>
-              <w:t xml:space="preserve">CU-03: Transición de Estados</w:t>
-            </w:r>
-          </w:p>
-        </w:tc>
-        <w:tc>
-          <w:tcPr/>
-          <w:p>
-            <w:pPr>
-              <w:pStyle w:val="Compact"/>
-              <w:jc w:val="left"/>
-            </w:pPr>
-            <w:r>
-              <w:t xml:space="preserve">Máquina de estados finitos (</w:t>
-            </w:r>
-            <w:r>
-              <w:rPr>
-                <w:rStyle w:val="VerbatimChar"/>
-              </w:rPr>
-              <w:t xml:space="preserve">Recibido</w:t>
-            </w:r>
-            <w:r>
-              <w:t xml:space="preserve"> </w:t>
-            </w:r>
-            <w:r>
-              <w:t xml:space="preserve">➔</w:t>
-            </w:r>
-            <w:r>
-              <w:t xml:space="preserve"> </w:t>
-            </w:r>
-            <w:r>
-              <w:rPr>
-                <w:rStyle w:val="VerbatimChar"/>
-              </w:rPr>
-              <w:t xml:space="preserve">En Preparación</w:t>
-            </w:r>
-            <w:r>
-              <w:t xml:space="preserve"> </w:t>
-            </w:r>
-            <w:r>
-              <w:t xml:space="preserve">➔</w:t>
-            </w:r>
-            <w:r>
-              <w:t xml:space="preserve"> </w:t>
-            </w:r>
-            <w:r>
-              <w:rPr>
-                <w:rStyle w:val="VerbatimChar"/>
-              </w:rPr>
-              <w:t xml:space="preserve">En Camino</w:t>
-            </w:r>
-            <w:r>
-              <w:t xml:space="preserve"> </w:t>
-            </w:r>
-            <w:r>
-              <w:t xml:space="preserve">➔</w:t>
-            </w:r>
-            <w:r>
-              <w:t xml:space="preserve"> </w:t>
-            </w:r>
-            <w:r>
-              <w:rPr>
-                <w:rStyle w:val="VerbatimChar"/>
-              </w:rPr>
-              <w:t xml:space="preserve">Entregado</w:t>
-            </w:r>
-            <w:r>
-              <w:t xml:space="preserve">); inserción de log en tabla de auditoría; actualización en tiempo real en la lista.</w:t>
-            </w:r>
-          </w:p>
-        </w:tc>
-        <w:tc>
-          <w:tcPr/>
-          <w:p>
-            <w:pPr>
-              <w:pStyle w:val="Compact"/>
-              <w:jc w:val="left"/>
-            </w:pPr>
-            <w:r>
-              <w:rPr>
-                <w:rStyle w:val="VerbatimChar"/>
-              </w:rPr>
-              <w:t xml:space="preserve">PedidosLista.tsx</w:t>
-            </w:r>
-            <w:r>
-              <w:t xml:space="preserve">,</w:t>
-            </w:r>
-            <w:r>
-              <w:t xml:space="preserve"> </w:t>
-            </w:r>
-            <w:r>
-              <w:rPr>
-                <w:rStyle w:val="VerbatimChar"/>
-              </w:rPr>
-              <w:t xml:space="preserve">OrderService</w:t>
-            </w:r>
-            <w:r>
-              <w:t xml:space="preserve">,</w:t>
-            </w:r>
-            <w:r>
-              <w:t xml:space="preserve"> </w:t>
-            </w:r>
-            <w:r>
-              <w:rPr>
-                <w:rStyle w:val="VerbatimChar"/>
-              </w:rPr>
-              <w:t xml:space="preserve">order_status_history</w:t>
-            </w:r>
-            <w:r>
-              <w:t xml:space="preserve">.</w:t>
-            </w:r>
-          </w:p>
-        </w:tc>
-      </w:tr>
-      <w:tr>
-        <w:tc>
-          <w:tcPr/>
-          <w:p>
-            <w:pPr>
-              <w:pStyle w:val="Compact"/>
-              <w:jc w:val="left"/>
-            </w:pPr>
-            <w:r>
-              <w:rPr>
-                <w:b/>
-                <w:bCs/>
-              </w:rPr>
-              <w:t xml:space="preserve">CU-04: Alerta de Stock Crítico</w:t>
-            </w:r>
-          </w:p>
-        </w:tc>
-        <w:tc>
-          <w:tcPr/>
-          <w:p>
-            <w:pPr>
-              <w:pStyle w:val="Compact"/>
-              <w:jc w:val="left"/>
-            </w:pPr>
-            <w:r>
-              <w:t xml:space="preserve">Evaluación de umbral (</w:t>
-            </w:r>
-            <w:r>
-              <w:rPr>
-                <w:rStyle w:val="VerbatimChar"/>
-              </w:rPr>
-              <w:t xml:space="preserve">stock &lt; 5</w:t>
-            </w:r>
-            <w:r>
-              <w:t xml:space="preserve">); inyección de badges visuales pulsantes; bloqueo preventivo de pedidos que excedan el saldo disponible.</w:t>
-            </w:r>
-          </w:p>
-        </w:tc>
-        <w:tc>
-          <w:tcPr/>
-          <w:p>
-            <w:pPr>
-              <w:pStyle w:val="Compact"/>
-              <w:jc w:val="left"/>
-            </w:pPr>
-            <w:r>
-              <w:rPr>
-                <w:rStyle w:val="VerbatimChar"/>
-              </w:rPr>
-              <w:t xml:space="preserve">ProductosGestion.tsx</w:t>
-            </w:r>
-            <w:r>
-              <w:t xml:space="preserve">,</w:t>
-            </w:r>
-            <w:r>
-              <w:t xml:space="preserve"> </w:t>
-            </w:r>
-            <w:r>
-              <w:rPr>
-                <w:rStyle w:val="VerbatimChar"/>
-              </w:rPr>
-              <w:t xml:space="preserve">Dashboard.tsx</w:t>
-            </w:r>
-            <w:r>
-              <w:t xml:space="preserve">,</w:t>
-            </w:r>
-            <w:r>
-              <w:t xml:space="preserve"> </w:t>
-            </w:r>
-            <w:r>
-              <w:rPr>
-                <w:rStyle w:val="VerbatimChar"/>
-              </w:rPr>
-              <w:t xml:space="preserve">product_variants</w:t>
-            </w:r>
-            <w:r>
-              <w:t xml:space="preserve">.</w:t>
-            </w:r>
-          </w:p>
-        </w:tc>
-      </w:tr>
-    </w:tbl>
+        <w:t xml:space="preserve">4.5. Vista de Datos: Modelo Entidad-Relación (ERD)</w:t>
+      </w:r>
+    </w:p>
+    <w:p>
+      <w:pPr>
+        <w:pStyle w:val="SourceCode"/>
+      </w:pPr>
+      <w:r>
+        <w:rPr>
+          <w:rStyle w:val="VerbatimChar"/>
+        </w:rPr>
+        <w:t xml:space="preserve">erDiagram</w:t>
+      </w:r>
+      <w:r>
+        <w:br/>
+      </w:r>
+      <w:r>
+        <w:rPr>
+          <w:rStyle w:val="VerbatimChar"/>
+        </w:rPr>
+        <w:t xml:space="preserve">    USERS ||--o{ ORDERS : "registra / audita"</w:t>
+      </w:r>
+      <w:r>
+        <w:br/>
+      </w:r>
+      <w:r>
+        <w:rPr>
+          <w:rStyle w:val="VerbatimChar"/>
+        </w:rPr>
+        <w:t xml:space="preserve">    CLIENTS ||--o{ ORDERS : "realiza"</w:t>
+      </w:r>
+      <w:r>
+        <w:br/>
+      </w:r>
+      <w:r>
+        <w:rPr>
+          <w:rStyle w:val="VerbatimChar"/>
+        </w:rPr>
+        <w:t xml:space="preserve">    CATEGORIES ||--|{ PRODUCTS : "clasifica"</w:t>
+      </w:r>
+      <w:r>
+        <w:br/>
+      </w:r>
+      <w:r>
+        <w:rPr>
+          <w:rStyle w:val="VerbatimChar"/>
+        </w:rPr>
+        <w:t xml:space="preserve">    PRODUCTS ||--|{ PRODUCT_VARIANTS : "posee"</w:t>
+      </w:r>
+      <w:r>
+        <w:br/>
+      </w:r>
+      <w:r>
+        <w:rPr>
+          <w:rStyle w:val="VerbatimChar"/>
+        </w:rPr>
+        <w:t xml:space="preserve">    PRODUCT_VARIANTS ||--o{ ORDER_ITEMS : "incluido_en"</w:t>
+      </w:r>
+      <w:r>
+        <w:br/>
+      </w:r>
+      <w:r>
+        <w:rPr>
+          <w:rStyle w:val="VerbatimChar"/>
+        </w:rPr>
+        <w:t xml:space="preserve">    ORDERS ||--|{ ORDER_ITEMS : "contiene"</w:t>
+      </w:r>
+      <w:r>
+        <w:br/>
+      </w:r>
+      <w:r>
+        <w:rPr>
+          <w:rStyle w:val="VerbatimChar"/>
+        </w:rPr>
+        <w:t xml:space="preserve">    ORDERS ||--|{ ORDER_STATUS_HISTORY : "registra_historial"</w:t>
+      </w:r>
+      <w:r>
+        <w:br/>
+      </w:r>
+      <w:r>
+        <w:br/>
+      </w:r>
+      <w:r>
+        <w:rPr>
+          <w:rStyle w:val="VerbatimChar"/>
+        </w:rPr>
+        <w:t xml:space="preserve">    USERS {</w:t>
+      </w:r>
+      <w:r>
+        <w:br/>
+      </w:r>
+      <w:r>
+        <w:rPr>
+          <w:rStyle w:val="VerbatimChar"/>
+        </w:rPr>
+        <w:t xml:space="preserve">        int id PK</w:t>
+      </w:r>
+      <w:r>
+        <w:br/>
+      </w:r>
+      <w:r>
+        <w:rPr>
+          <w:rStyle w:val="VerbatimChar"/>
+        </w:rPr>
+        <w:t xml:space="preserve">        string name</w:t>
+      </w:r>
+      <w:r>
+        <w:br/>
+      </w:r>
+      <w:r>
+        <w:rPr>
+          <w:rStyle w:val="VerbatimChar"/>
+        </w:rPr>
+        <w:t xml:space="preserve">        string email UK</w:t>
+      </w:r>
+      <w:r>
+        <w:br/>
+      </w:r>
+      <w:r>
+        <w:rPr>
+          <w:rStyle w:val="VerbatimChar"/>
+        </w:rPr>
+        <w:t xml:space="preserve">        string password_hash</w:t>
+      </w:r>
+      <w:r>
+        <w:br/>
+      </w:r>
+      <w:r>
+        <w:rPr>
+          <w:rStyle w:val="VerbatimChar"/>
+        </w:rPr>
+        <w:t xml:space="preserve">        enum role "ADMIN, OPERATOR"</w:t>
+      </w:r>
+      <w:r>
+        <w:br/>
+      </w:r>
+      <w:r>
+        <w:rPr>
+          <w:rStyle w:val="VerbatimChar"/>
+        </w:rPr>
+        <w:t xml:space="preserve">        datetime created_at</w:t>
+      </w:r>
+      <w:r>
+        <w:br/>
+      </w:r>
+      <w:r>
+        <w:rPr>
+          <w:rStyle w:val="VerbatimChar"/>
+        </w:rPr>
+        <w:t xml:space="preserve">    }</w:t>
+      </w:r>
+      <w:r>
+        <w:br/>
+      </w:r>
+      <w:r>
+        <w:br/>
+      </w:r>
+      <w:r>
+        <w:rPr>
+          <w:rStyle w:val="VerbatimChar"/>
+        </w:rPr>
+        <w:t xml:space="preserve">    CATEGORIES {</w:t>
+      </w:r>
+      <w:r>
+        <w:br/>
+      </w:r>
+      <w:r>
+        <w:rPr>
+          <w:rStyle w:val="VerbatimChar"/>
+        </w:rPr>
+        <w:t xml:space="preserve">        int id PK</w:t>
+      </w:r>
+      <w:r>
+        <w:br/>
+      </w:r>
+      <w:r>
+        <w:rPr>
+          <w:rStyle w:val="VerbatimChar"/>
+        </w:rPr>
+        <w:t xml:space="preserve">        string name</w:t>
+      </w:r>
+      <w:r>
+        <w:br/>
+      </w:r>
+      <w:r>
+        <w:rPr>
+          <w:rStyle w:val="VerbatimChar"/>
+        </w:rPr>
+        <w:t xml:space="preserve">        text description</w:t>
+      </w:r>
+      <w:r>
+        <w:br/>
+      </w:r>
+      <w:r>
+        <w:rPr>
+          <w:rStyle w:val="VerbatimChar"/>
+        </w:rPr>
+        <w:t xml:space="preserve">    }</w:t>
+      </w:r>
+      <w:r>
+        <w:br/>
+      </w:r>
+      <w:r>
+        <w:br/>
+      </w:r>
+      <w:r>
+        <w:rPr>
+          <w:rStyle w:val="VerbatimChar"/>
+        </w:rPr>
+        <w:t xml:space="preserve">    PRODUCTS {</w:t>
+      </w:r>
+      <w:r>
+        <w:br/>
+      </w:r>
+      <w:r>
+        <w:rPr>
+          <w:rStyle w:val="VerbatimChar"/>
+        </w:rPr>
+        <w:t xml:space="preserve">        int id PK</w:t>
+      </w:r>
+      <w:r>
+        <w:br/>
+      </w:r>
+      <w:r>
+        <w:rPr>
+          <w:rStyle w:val="VerbatimChar"/>
+        </w:rPr>
+        <w:t xml:space="preserve">        int category_id FK</w:t>
+      </w:r>
+      <w:r>
+        <w:br/>
+      </w:r>
+      <w:r>
+        <w:rPr>
+          <w:rStyle w:val="VerbatimChar"/>
+        </w:rPr>
+        <w:t xml:space="preserve">        string name</w:t>
+      </w:r>
+      <w:r>
+        <w:br/>
+      </w:r>
+      <w:r>
+        <w:rPr>
+          <w:rStyle w:val="VerbatimChar"/>
+        </w:rPr>
+        <w:t xml:space="preserve">        text description</w:t>
+      </w:r>
+      <w:r>
+        <w:br/>
+      </w:r>
+      <w:r>
+        <w:rPr>
+          <w:rStyle w:val="VerbatimChar"/>
+        </w:rPr>
+        <w:t xml:space="preserve">        decimal base_price</w:t>
+      </w:r>
+      <w:r>
+        <w:br/>
+      </w:r>
+      <w:r>
+        <w:rPr>
+          <w:rStyle w:val="VerbatimChar"/>
+        </w:rPr>
+        <w:t xml:space="preserve">        string image_url</w:t>
+      </w:r>
+      <w:r>
+        <w:br/>
+      </w:r>
+      <w:r>
+        <w:rPr>
+          <w:rStyle w:val="VerbatimChar"/>
+        </w:rPr>
+        <w:t xml:space="preserve">        boolean is_active</w:t>
+      </w:r>
+      <w:r>
+        <w:br/>
+      </w:r>
+      <w:r>
+        <w:rPr>
+          <w:rStyle w:val="VerbatimChar"/>
+        </w:rPr>
+        <w:t xml:space="preserve">    }</w:t>
+      </w:r>
+      <w:r>
+        <w:br/>
+      </w:r>
+      <w:r>
+        <w:br/>
+      </w:r>
+      <w:r>
+        <w:rPr>
+          <w:rStyle w:val="VerbatimChar"/>
+        </w:rPr>
+        <w:t xml:space="preserve">    PRODUCT_VARIANTS {</w:t>
+      </w:r>
+      <w:r>
+        <w:br/>
+      </w:r>
+      <w:r>
+        <w:rPr>
+          <w:rStyle w:val="VerbatimChar"/>
+        </w:rPr>
+        <w:t xml:space="preserve">        int id PK</w:t>
+      </w:r>
+      <w:r>
+        <w:br/>
+      </w:r>
+      <w:r>
+        <w:rPr>
+          <w:rStyle w:val="VerbatimChar"/>
+        </w:rPr>
+        <w:t xml:space="preserve">        int product_id FK</w:t>
+      </w:r>
+      <w:r>
+        <w:br/>
+      </w:r>
+      <w:r>
+        <w:rPr>
+          <w:rStyle w:val="VerbatimChar"/>
+        </w:rPr>
+        <w:t xml:space="preserve">        string size "S, M, L, XL"</w:t>
+      </w:r>
+      <w:r>
+        <w:br/>
+      </w:r>
+      <w:r>
+        <w:rPr>
+          <w:rStyle w:val="VerbatimChar"/>
+        </w:rPr>
+        <w:t xml:space="preserve">        string color</w:t>
+      </w:r>
+      <w:r>
+        <w:br/>
+      </w:r>
+      <w:r>
+        <w:rPr>
+          <w:rStyle w:val="VerbatimChar"/>
+        </w:rPr>
+        <w:t xml:space="preserve">        string sku UK</w:t>
+      </w:r>
+      <w:r>
+        <w:br/>
+      </w:r>
+      <w:r>
+        <w:rPr>
+          <w:rStyle w:val="VerbatimChar"/>
+        </w:rPr>
+        <w:t xml:space="preserve">        int stock</w:t>
+      </w:r>
+      <w:r>
+        <w:br/>
+      </w:r>
+      <w:r>
+        <w:rPr>
+          <w:rStyle w:val="VerbatimChar"/>
+        </w:rPr>
+        <w:t xml:space="preserve">        int alert_threshold</w:t>
+      </w:r>
+      <w:r>
+        <w:br/>
+      </w:r>
+      <w:r>
+        <w:rPr>
+          <w:rStyle w:val="VerbatimChar"/>
+        </w:rPr>
+        <w:t xml:space="preserve">    }</w:t>
+      </w:r>
+      <w:r>
+        <w:br/>
+      </w:r>
+      <w:r>
+        <w:br/>
+      </w:r>
+      <w:r>
+        <w:rPr>
+          <w:rStyle w:val="VerbatimChar"/>
+        </w:rPr>
+        <w:t xml:space="preserve">    CLIENTS {</w:t>
+      </w:r>
+      <w:r>
+        <w:br/>
+      </w:r>
+      <w:r>
+        <w:rPr>
+          <w:rStyle w:val="VerbatimChar"/>
+        </w:rPr>
+        <w:t xml:space="preserve">        int id PK</w:t>
+      </w:r>
+      <w:r>
+        <w:br/>
+      </w:r>
+      <w:r>
+        <w:rPr>
+          <w:rStyle w:val="VerbatimChar"/>
+        </w:rPr>
+        <w:t xml:space="preserve">        string full_name</w:t>
+      </w:r>
+      <w:r>
+        <w:br/>
+      </w:r>
+      <w:r>
+        <w:rPr>
+          <w:rStyle w:val="VerbatimChar"/>
+        </w:rPr>
+        <w:t xml:space="preserve">        string phone</w:t>
+      </w:r>
+      <w:r>
+        <w:br/>
+      </w:r>
+      <w:r>
+        <w:rPr>
+          <w:rStyle w:val="VerbatimChar"/>
+        </w:rPr>
+        <w:t xml:space="preserve">        text address</w:t>
+      </w:r>
+      <w:r>
+        <w:br/>
+      </w:r>
+      <w:r>
+        <w:rPr>
+          <w:rStyle w:val="VerbatimChar"/>
+        </w:rPr>
+        <w:t xml:space="preserve">        string district</w:t>
+      </w:r>
+      <w:r>
+        <w:br/>
+      </w:r>
+      <w:r>
+        <w:rPr>
+          <w:rStyle w:val="VerbatimChar"/>
+        </w:rPr>
+        <w:t xml:space="preserve">        text reference</w:t>
+      </w:r>
+      <w:r>
+        <w:br/>
+      </w:r>
+      <w:r>
+        <w:rPr>
+          <w:rStyle w:val="VerbatimChar"/>
+        </w:rPr>
+        <w:t xml:space="preserve">    }</w:t>
+      </w:r>
+      <w:r>
+        <w:br/>
+      </w:r>
+      <w:r>
+        <w:br/>
+      </w:r>
+      <w:r>
+        <w:rPr>
+          <w:rStyle w:val="VerbatimChar"/>
+        </w:rPr>
+        <w:t xml:space="preserve">    ORDERS {</w:t>
+      </w:r>
+      <w:r>
+        <w:br/>
+      </w:r>
+      <w:r>
+        <w:rPr>
+          <w:rStyle w:val="VerbatimChar"/>
+        </w:rPr>
+        <w:t xml:space="preserve">        int id PK</w:t>
+      </w:r>
+      <w:r>
+        <w:br/>
+      </w:r>
+      <w:r>
+        <w:rPr>
+          <w:rStyle w:val="VerbatimChar"/>
+        </w:rPr>
+        <w:t xml:space="preserve">        string order_number UK</w:t>
+      </w:r>
+      <w:r>
+        <w:br/>
+      </w:r>
+      <w:r>
+        <w:rPr>
+          <w:rStyle w:val="VerbatimChar"/>
+        </w:rPr>
+        <w:t xml:space="preserve">        int client_id FK</w:t>
+      </w:r>
+      <w:r>
+        <w:br/>
+      </w:r>
+      <w:r>
+        <w:rPr>
+          <w:rStyle w:val="VerbatimChar"/>
+        </w:rPr>
+        <w:t xml:space="preserve">        enum status "RECIBIDO, PREPARACION, EN_CAMINO, ENTREGADO, CANCELADO"</w:t>
+      </w:r>
+      <w:r>
+        <w:br/>
+      </w:r>
+      <w:r>
+        <w:rPr>
+          <w:rStyle w:val="VerbatimChar"/>
+        </w:rPr>
+        <w:t xml:space="preserve">        decimal subtotal</w:t>
+      </w:r>
+      <w:r>
+        <w:br/>
+      </w:r>
+      <w:r>
+        <w:rPr>
+          <w:rStyle w:val="VerbatimChar"/>
+        </w:rPr>
+        <w:t xml:space="preserve">        decimal shipping_cost</w:t>
+      </w:r>
+      <w:r>
+        <w:br/>
+      </w:r>
+      <w:r>
+        <w:rPr>
+          <w:rStyle w:val="VerbatimChar"/>
+        </w:rPr>
+        <w:t xml:space="preserve">        decimal total_amount</w:t>
+      </w:r>
+      <w:r>
+        <w:br/>
+      </w:r>
+      <w:r>
+        <w:rPr>
+          <w:rStyle w:val="VerbatimChar"/>
+        </w:rPr>
+        <w:t xml:space="preserve">        enum payment_method "YAPE, PLIN, TRANSFERENCIA, CONTRAENTREGA"</w:t>
+      </w:r>
+      <w:r>
+        <w:br/>
+      </w:r>
+      <w:r>
+        <w:rPr>
+          <w:rStyle w:val="VerbatimChar"/>
+        </w:rPr>
+        <w:t xml:space="preserve">        text notes</w:t>
+      </w:r>
+      <w:r>
+        <w:br/>
+      </w:r>
+      <w:r>
+        <w:rPr>
+          <w:rStyle w:val="VerbatimChar"/>
+        </w:rPr>
+        <w:t xml:space="preserve">        datetime created_at</w:t>
+      </w:r>
+      <w:r>
+        <w:br/>
+      </w:r>
+      <w:r>
+        <w:rPr>
+          <w:rStyle w:val="VerbatimChar"/>
+        </w:rPr>
+        <w:t xml:space="preserve">        datetime updated_at</w:t>
+      </w:r>
+      <w:r>
+        <w:br/>
+      </w:r>
+      <w:r>
+        <w:rPr>
+          <w:rStyle w:val="VerbatimChar"/>
+        </w:rPr>
+        <w:t xml:space="preserve">    }</w:t>
+      </w:r>
+      <w:r>
+        <w:br/>
+      </w:r>
+      <w:r>
+        <w:br/>
+      </w:r>
+      <w:r>
+        <w:rPr>
+          <w:rStyle w:val="VerbatimChar"/>
+        </w:rPr>
+        <w:t xml:space="preserve">    ORDER_ITEMS {</w:t>
+      </w:r>
+      <w:r>
+        <w:br/>
+      </w:r>
+      <w:r>
+        <w:rPr>
+          <w:rStyle w:val="VerbatimChar"/>
+        </w:rPr>
+        <w:t xml:space="preserve">        int id PK</w:t>
+      </w:r>
+      <w:r>
+        <w:br/>
+      </w:r>
+      <w:r>
+        <w:rPr>
+          <w:rStyle w:val="VerbatimChar"/>
+        </w:rPr>
+        <w:t xml:space="preserve">        int order_id FK</w:t>
+      </w:r>
+      <w:r>
+        <w:br/>
+      </w:r>
+      <w:r>
+        <w:rPr>
+          <w:rStyle w:val="VerbatimChar"/>
+        </w:rPr>
+        <w:t xml:space="preserve">        int variant_id FK</w:t>
+      </w:r>
+      <w:r>
+        <w:br/>
+      </w:r>
+      <w:r>
+        <w:rPr>
+          <w:rStyle w:val="VerbatimChar"/>
+        </w:rPr>
+        <w:t xml:space="preserve">        int quantity</w:t>
+      </w:r>
+      <w:r>
+        <w:br/>
+      </w:r>
+      <w:r>
+        <w:rPr>
+          <w:rStyle w:val="VerbatimChar"/>
+        </w:rPr>
+        <w:t xml:space="preserve">        decimal unit_price</w:t>
+      </w:r>
+      <w:r>
+        <w:br/>
+      </w:r>
+      <w:r>
+        <w:rPr>
+          <w:rStyle w:val="VerbatimChar"/>
+        </w:rPr>
+        <w:t xml:space="preserve">        decimal subtotal</w:t>
+      </w:r>
+      <w:r>
+        <w:br/>
+      </w:r>
+      <w:r>
+        <w:rPr>
+          <w:rStyle w:val="VerbatimChar"/>
+        </w:rPr>
+        <w:t xml:space="preserve">    }</w:t>
+      </w:r>
+      <w:r>
+        <w:br/>
+      </w:r>
+      <w:r>
+        <w:br/>
+      </w:r>
+      <w:r>
+        <w:rPr>
+          <w:rStyle w:val="VerbatimChar"/>
+        </w:rPr>
+        <w:t xml:space="preserve">    ORDER_STATUS_HISTORY {</w:t>
+      </w:r>
+      <w:r>
+        <w:br/>
+      </w:r>
+      <w:r>
+        <w:rPr>
+          <w:rStyle w:val="VerbatimChar"/>
+        </w:rPr>
+        <w:t xml:space="preserve">        int id PK</w:t>
+      </w:r>
+      <w:r>
+        <w:br/>
+      </w:r>
+      <w:r>
+        <w:rPr>
+          <w:rStyle w:val="VerbatimChar"/>
+        </w:rPr>
+        <w:t xml:space="preserve">        int order_id FK</w:t>
+      </w:r>
+      <w:r>
+        <w:br/>
+      </w:r>
+      <w:r>
+        <w:rPr>
+          <w:rStyle w:val="VerbatimChar"/>
+        </w:rPr>
+        <w:t xml:space="preserve">        string previous_status</w:t>
+      </w:r>
+      <w:r>
+        <w:br/>
+      </w:r>
+      <w:r>
+        <w:rPr>
+          <w:rStyle w:val="VerbatimChar"/>
+        </w:rPr>
+        <w:t xml:space="preserve">        string new_status</w:t>
+      </w:r>
+      <w:r>
+        <w:br/>
+      </w:r>
+      <w:r>
+        <w:rPr>
+          <w:rStyle w:val="VerbatimChar"/>
+        </w:rPr>
+        <w:t xml:space="preserve">        datetime changed_at</w:t>
+      </w:r>
+      <w:r>
+        <w:br/>
+      </w:r>
+      <w:r>
+        <w:rPr>
+          <w:rStyle w:val="VerbatimChar"/>
+        </w:rPr>
+        <w:t xml:space="preserve">        text comments</w:t>
+      </w:r>
+      <w:r>
+        <w:br/>
+      </w:r>
+      <w:r>
+        <w:rPr>
+          <w:rStyle w:val="VerbatimChar"/>
+        </w:rPr>
+        <w:t xml:space="preserve">    }</w:t>
+      </w:r>
+    </w:p>
     <w:p>
       <w:r>
         <w:pict>

</xml_diff>